<commit_message>
Update Word document (.docx) with screenshots captured directly from live app http://localhost:8081/
</commit_message>
<xml_diff>
--- a/Agent_Policy_and_Regulatory_Compliance_Specification.docx
+++ b/Agent_Policy_and_Regulatory_Compliance_Specification.docx
@@ -25,9 +25,9 @@
           <w:rFonts w:ascii="Arial" w:hAnsi="Arial"/>
           <w:b/>
           <w:color w:val="5F6368"/>
-          <w:sz w:val="24"/>
+          <w:sz w:val="23"/>
         </w:rPr>
-        <w:t>Narrowed Governance Architecture &amp; Regulatory Enforcement Specification</w:t>
+        <w:t>Regulatory Enforcement Architecture &amp; Live Application Screenshots (http://localhost:8081/)</w:t>
         <w:br/>
         <w:t>Google AI Ecosystem — Gemini Enterprise Agent Platform</w:t>
       </w:r>
@@ -90,7 +90,7 @@
                 <w:color w:val="3C4043"/>
                 <w:sz w:val="19"/>
               </w:rPr>
-              <w:t>Agent Policy Engine, Regulatory Compliance, Cryptographic Auditing</w:t>
+              <w:t>Agent Policy Engine, Regulatory Compliance, PII/PHI Redaction, Cryptographic Auditing</w:t>
             </w:r>
           </w:p>
         </w:tc>
@@ -117,7 +117,7 @@
                 <w:color w:val="3C4043"/>
                 <w:sz w:val="19"/>
               </w:rPr>
-              <w:t>Regulatory Scope:</w:t>
+              <w:t>Regulatory Frameworks:</w:t>
             </w:r>
           </w:p>
         </w:tc>
@@ -169,7 +169,7 @@
                 <w:color w:val="3C4043"/>
                 <w:sz w:val="19"/>
               </w:rPr>
-              <w:t>Target Platform:</w:t>
+              <w:t>Screenshot Source:</w:t>
             </w:r>
           </w:p>
         </w:tc>
@@ -194,7 +194,7 @@
                 <w:color w:val="3C4043"/>
                 <w:sz w:val="19"/>
               </w:rPr>
-              <w:t>Gemini Enterprise Agent Platform, Cloud Run Gateway, Cloud DLP, Cloud KMS, BigQuery</w:t>
+              <w:t>Captured Live from Running Application at http://localhost:8081/</w:t>
             </w:r>
           </w:p>
         </w:tc>
@@ -223,7 +223,7 @@
         <w:spacing w:after="200"/>
       </w:pPr>
       <w:r>
-        <w:t>This document defines the narrowed technical specification for the **Agent Policy and Compliance Engine** operating within the **Gemini Enterprise Agent Platform**. It focuses specifically on regulatory compliance guardrails, zero-trust inter-agent policy enforcement, and cryptographically verifiable audit trails required for enterprise compliance sign-off.</w:t>
+        <w:t>This document defines the narrowed technical specification for the **Agent Policy and Compliance Engine** operating within the **Gemini Enterprise Agent Platform**. It focuses specifically on regulatory compliance guardrails, zero-trust inter-agent policy enforcement, and cryptographically verifiable audit trails required for enterprise compliance sign-off. All embedded screenshots in this document are captured directly from the live application at **http://localhost:8081/**.</w:t>
       </w:r>
     </w:p>
     <w:p>
@@ -315,7 +315,7 @@
                 <w:color w:val="FFFFFF"/>
                 <w:sz w:val="19"/>
               </w:rPr>
-              <w:t>Agent Policy Engine Mechanism</w:t>
+              <w:t>Agent Policy Engine Control Mechanism</w:t>
             </w:r>
           </w:p>
         </w:tc>
@@ -773,7 +773,7 @@
           <w:color w:val="1A73E8"/>
           <w:sz w:val="30"/>
         </w:rPr>
-        <w:t>3. Feature-Wise Agent Policy &amp; Compliance Implementation Roadmap</w:t>
+        <w:t>3. Feature-Wise Agent Policy Roadmap &amp; Application Screenshots</w:t>
       </w:r>
     </w:p>
     <w:p>
@@ -794,7 +794,7 @@
         <w:spacing w:after="160"/>
       </w:pPr>
       <w:r>
-        <w:t>Establishes a high-throughput Policy Ingress Gateway on Cloud Run that inspects 100% of prompts, tool outputs, and inter-agent messages before model execution.</w:t>
+        <w:t>Establishes a high-throughput Policy Ingress Gateway on Cloud Run inspecting 100% of prompts, tool outputs, and inter-agent messages before model execution.</w:t>
       </w:r>
     </w:p>
     <w:p>
@@ -805,7 +805,7 @@
       <w:r>
         <w:drawing>
           <wp:inline xmlns:a="http://schemas.openxmlformats.org/drawingml/2006/main" xmlns:pic="http://schemas.openxmlformats.org/drawingml/2006/picture">
-            <wp:extent cx="5486400" cy="5486400"/>
+            <wp:extent cx="5486400" cy="3429000"/>
             <wp:docPr id="1" name="Picture 1"/>
             <wp:cNvGraphicFramePr>
               <a:graphicFrameLocks noChangeAspect="1"/>
@@ -814,7 +814,7 @@
               <a:graphicData uri="http://schemas.openxmlformats.org/drawingml/2006/picture">
                 <pic:pic>
                   <pic:nvPicPr>
-                    <pic:cNvPr id="0" name="regulatory_policy_engine_1784557704068.png"/>
+                    <pic:cNvPr id="0" name="app_rules.png"/>
                     <pic:cNvPicPr/>
                   </pic:nvPicPr>
                   <pic:blipFill>
@@ -826,7 +826,7 @@
                   <pic:spPr>
                     <a:xfrm>
                       <a:off x="0" y="0"/>
-                      <a:ext cx="5486400" cy="5486400"/>
+                      <a:ext cx="5486400" cy="3429000"/>
                     </a:xfrm>
                     <a:prstGeom prst="rect"/>
                   </pic:spPr>
@@ -848,7 +848,7 @@
           <w:color w:val="5F6368"/>
           <w:sz w:val="18"/>
         </w:rPr>
-        <w:t>Figure 1: Agent Policy Engine Console (Active Rules: GDPR-ERASURE, DPDP-AADHAAR, SOC2-INTEGRITY, HIPAA-PII)</w:t>
+        <w:t>Figure 1: Live Application Screenshot from http://localhost:8081/?tab=rules — Agent Policy Engine &amp; Active Guardrails (GDPR-ERASURE, DPDP-AADHAAR, SOC2-INTEGRITY, HIPAA-PII)</w:t>
       </w:r>
     </w:p>
     <w:tbl>
@@ -1072,7 +1072,7 @@
       <w:r>
         <w:drawing>
           <wp:inline xmlns:a="http://schemas.openxmlformats.org/drawingml/2006/main" xmlns:pic="http://schemas.openxmlformats.org/drawingml/2006/picture">
-            <wp:extent cx="5486400" cy="5486400"/>
+            <wp:extent cx="5486400" cy="3429000"/>
             <wp:docPr id="2" name="Picture 2"/>
             <wp:cNvGraphicFramePr>
               <a:graphicFrameLocks noChangeAspect="1"/>
@@ -1081,7 +1081,7 @@
               <a:graphicData uri="http://schemas.openxmlformats.org/drawingml/2006/picture">
                 <pic:pic>
                   <pic:nvPicPr>
-                    <pic:cNvPr id="0" name="pii_phi_redaction_compliance_1784557719688.png"/>
+                    <pic:cNvPr id="0" name="app_compliance.png"/>
                     <pic:cNvPicPr/>
                   </pic:nvPicPr>
                   <pic:blipFill>
@@ -1093,7 +1093,7 @@
                   <pic:spPr>
                     <a:xfrm>
                       <a:off x="0" y="0"/>
-                      <a:ext cx="5486400" cy="5486400"/>
+                      <a:ext cx="5486400" cy="3429000"/>
                     </a:xfrm>
                     <a:prstGeom prst="rect"/>
                   </pic:spPr>
@@ -1115,7 +1115,7 @@
           <w:color w:val="5F6368"/>
           <w:sz w:val="18"/>
         </w:rPr>
-        <w:t>Figure 2: PII/PHI Redaction Compliance Inspection Dashboard (Indian Aadhaar, MRN, SSN Masking)</w:t>
+        <w:t>Figure 2: Live Application Screenshot from http://localhost:8081/?tab=compliance — Multi-Framework Regulatory Compliance Auditor Console</w:t>
       </w:r>
     </w:p>
     <w:tbl>
@@ -1339,7 +1339,7 @@
       <w:r>
         <w:drawing>
           <wp:inline xmlns:a="http://schemas.openxmlformats.org/drawingml/2006/main" xmlns:pic="http://schemas.openxmlformats.org/drawingml/2006/picture">
-            <wp:extent cx="5486400" cy="5486400"/>
+            <wp:extent cx="5486400" cy="3429000"/>
             <wp:docPr id="3" name="Picture 3"/>
             <wp:cNvGraphicFramePr>
               <a:graphicFrameLocks noChangeAspect="1"/>
@@ -1348,7 +1348,7 @@
               <a:graphicData uri="http://schemas.openxmlformats.org/drawingml/2006/picture">
                 <pic:pic>
                   <pic:nvPicPr>
-                    <pic:cNvPr id="0" name="safety_grounding_policy_1784557733647.png"/>
+                    <pic:cNvPr id="0" name="app_grounding.png"/>
                     <pic:cNvPicPr/>
                   </pic:nvPicPr>
                   <pic:blipFill>
@@ -1360,7 +1360,7 @@
                   <pic:spPr>
                     <a:xfrm>
                       <a:off x="0" y="0"/>
-                      <a:ext cx="5486400" cy="5486400"/>
+                      <a:ext cx="5486400" cy="3429000"/>
                     </a:xfrm>
                     <a:prstGeom prst="rect"/>
                   </pic:spPr>
@@ -1382,7 +1382,7 @@
           <w:color w:val="5F6368"/>
           <w:sz w:val="18"/>
         </w:rPr>
-        <w:t>Figure 3: Gemini Safety Guardrails &amp; Agent Search Grounding Fact-Checking Console</w:t>
+        <w:t>Figure 3: Live Application Screenshot from http://localhost:8081/?tab=grounding — Agent Search Citation Grounding Verification &amp; Explainability Console</w:t>
       </w:r>
     </w:p>
     <w:tbl>
@@ -1606,7 +1606,7 @@
       <w:r>
         <w:drawing>
           <wp:inline xmlns:a="http://schemas.openxmlformats.org/drawingml/2006/main" xmlns:pic="http://schemas.openxmlformats.org/drawingml/2006/picture">
-            <wp:extent cx="5486400" cy="5486400"/>
+            <wp:extent cx="5486400" cy="3429000"/>
             <wp:docPr id="4" name="Picture 4"/>
             <wp:cNvGraphicFramePr>
               <a:graphicFrameLocks noChangeAspect="1"/>
@@ -1615,7 +1615,7 @@
               <a:graphicData uri="http://schemas.openxmlformats.org/drawingml/2006/picture">
                 <pic:pic>
                   <pic:nvPicPr>
-                    <pic:cNvPr id="0" name="compliance_audit_ledger_report_1784557748363.png"/>
+                    <pic:cNvPr id="0" name="app_audit.png"/>
                     <pic:cNvPicPr/>
                   </pic:nvPicPr>
                   <pic:blipFill>
@@ -1627,7 +1627,7 @@
                   <pic:spPr>
                     <a:xfrm>
                       <a:off x="0" y="0"/>
-                      <a:ext cx="5486400" cy="5486400"/>
+                      <a:ext cx="5486400" cy="3429000"/>
                     </a:xfrm>
                     <a:prstGeom prst="rect"/>
                   </pic:spPr>
@@ -1649,7 +1649,7 @@
           <w:color w:val="5F6368"/>
           <w:sz w:val="18"/>
         </w:rPr>
-        <w:t>Figure 4: Cryptographic Compliance Audit Ledger &amp; SOC 2 / HIPAA Audit Package Exporter</w:t>
+        <w:t>Figure 4: Live Application Screenshot from http://localhost:8081/?tab=audit — Tamper-Evident Cryptographic Audit Ledger &amp; Chain Verifier</w:t>
       </w:r>
     </w:p>
     <w:tbl>
@@ -1834,6 +1834,540 @@
                 <w:sz w:val="18"/>
               </w:rPr>
               <w:t>Generate signed PDF and CSV compliance audit packages for SOC 2 Type II and HIPAA regulatory audits.</w:t>
+            </w:r>
+          </w:p>
+        </w:tc>
+      </w:tr>
+    </w:tbl>
+    <w:p>
+      <w:pPr>
+        <w:spacing w:after="240"/>
+      </w:pPr>
+    </w:p>
+    <w:p>
+      <w:pPr>
+        <w:spacing w:before="280" w:after="80"/>
+      </w:pPr>
+      <w:r>
+        <w:rPr>
+          <w:b/>
+          <w:color w:val="1A73E8"/>
+          <w:sz w:val="26"/>
+        </w:rPr>
+        <w:t>Feature 5: Compliance Officer Control Console &amp; Real-Time Telemetry Stream</w:t>
+      </w:r>
+    </w:p>
+    <w:p>
+      <w:pPr>
+        <w:spacing w:after="160"/>
+      </w:pPr>
+      <w:r>
+        <w:t>Provides a real-time command center rendering incoming prompt volumes, blocked attempts, PII redaction counters, and average latency metrics.</w:t>
+      </w:r>
+    </w:p>
+    <w:p>
+      <w:pPr>
+        <w:spacing w:before="80" w:after="80"/>
+        <w:jc w:val="center"/>
+      </w:pPr>
+      <w:r>
+        <w:drawing>
+          <wp:inline xmlns:a="http://schemas.openxmlformats.org/drawingml/2006/main" xmlns:pic="http://schemas.openxmlformats.org/drawingml/2006/picture">
+            <wp:extent cx="5486400" cy="3429000"/>
+            <wp:docPr id="5" name="Picture 5"/>
+            <wp:cNvGraphicFramePr>
+              <a:graphicFrameLocks noChangeAspect="1"/>
+            </wp:cNvGraphicFramePr>
+            <a:graphic>
+              <a:graphicData uri="http://schemas.openxmlformats.org/drawingml/2006/picture">
+                <pic:pic>
+                  <pic:nvPicPr>
+                    <pic:cNvPr id="0" name="app_dashboard.png"/>
+                    <pic:cNvPicPr/>
+                  </pic:nvPicPr>
+                  <pic:blipFill>
+                    <a:blip r:embed="rId13"/>
+                    <a:stretch>
+                      <a:fillRect/>
+                    </a:stretch>
+                  </pic:blipFill>
+                  <pic:spPr>
+                    <a:xfrm>
+                      <a:off x="0" y="0"/>
+                      <a:ext cx="5486400" cy="3429000"/>
+                    </a:xfrm>
+                    <a:prstGeom prst="rect"/>
+                  </pic:spPr>
+                </pic:pic>
+              </a:graphicData>
+            </a:graphic>
+          </wp:inline>
+        </w:drawing>
+      </w:r>
+    </w:p>
+    <w:p>
+      <w:pPr>
+        <w:spacing w:after="200"/>
+        <w:jc w:val="center"/>
+      </w:pPr>
+      <w:r>
+        <w:rPr>
+          <w:i/>
+          <w:color w:val="5F6368"/>
+          <w:sz w:val="18"/>
+        </w:rPr>
+        <w:t>Figure 5: Live Application Screenshot from http://localhost:8081/?tab=dashboard — Control Tower Live Metrics &amp; Risk Telemetry Stream</w:t>
+      </w:r>
+    </w:p>
+    <w:tbl>
+      <w:tblPr>
+        <w:tblW w:type="auto" w:w="0"/>
+        <w:jc w:val="center"/>
+        <w:tblLayout w:type="fixed"/>
+        <w:tblLook w:firstColumn="1" w:firstRow="1" w:lastColumn="0" w:lastRow="0" w:noHBand="0" w:noVBand="1" w:val="04A0"/>
+      </w:tblPr>
+      <w:tblGrid>
+        <w:gridCol w:w="4968"/>
+        <w:gridCol w:w="4968"/>
+      </w:tblGrid>
+      <w:tr>
+        <w:tc>
+          <w:tcPr>
+            <w:tcW w:type="dxa" w:w="3168"/>
+            <w:shd w:fill="1A73E8"/>
+            <w:tcMar>
+              <w:top w:w="80" w:type="dxa"/>
+              <w:bottom w:w="80" w:type="dxa"/>
+              <w:left w:w="100" w:type="dxa"/>
+              <w:right w:w="100" w:type="dxa"/>
+            </w:tcMar>
+          </w:tcPr>
+          <w:p>
+            <w:r>
+              <w:rPr>
+                <w:b/>
+                <w:color w:val="FFFFFF"/>
+                <w:sz w:val="19"/>
+              </w:rPr>
+              <w:t>Policy Milestone</w:t>
+            </w:r>
+          </w:p>
+        </w:tc>
+        <w:tc>
+          <w:tcPr>
+            <w:tcW w:type="dxa" w:w="6192"/>
+            <w:shd w:fill="1A73E8"/>
+            <w:tcMar>
+              <w:top w:w="80" w:type="dxa"/>
+              <w:bottom w:w="80" w:type="dxa"/>
+              <w:left w:w="100" w:type="dxa"/>
+              <w:right w:w="100" w:type="dxa"/>
+            </w:tcMar>
+          </w:tcPr>
+          <w:p>
+            <w:r>
+              <w:rPr>
+                <w:b/>
+                <w:color w:val="FFFFFF"/>
+                <w:sz w:val="19"/>
+              </w:rPr>
+              <w:t>Deliverables &amp; Regulatory Verification</w:t>
+            </w:r>
+          </w:p>
+        </w:tc>
+      </w:tr>
+      <w:tr>
+        <w:tc>
+          <w:tcPr>
+            <w:tcW w:type="dxa" w:w="3168"/>
+            <w:shd w:fill="F8F9FA"/>
+            <w:tcMar>
+              <w:top w:w="80" w:type="dxa"/>
+              <w:bottom w:w="80" w:type="dxa"/>
+              <w:left w:w="100" w:type="dxa"/>
+              <w:right w:w="100" w:type="dxa"/>
+            </w:tcMar>
+          </w:tcPr>
+          <w:p>
+            <w:r>
+              <w:rPr>
+                <w:b/>
+                <w:sz w:val="18"/>
+              </w:rPr>
+              <w:t>Phase 5.1: Cloud Pub/Sub Streaming Bridge</w:t>
+            </w:r>
+          </w:p>
+        </w:tc>
+        <w:tc>
+          <w:tcPr>
+            <w:tcW w:type="dxa" w:w="6192"/>
+            <w:shd w:fill="F8F9FA"/>
+            <w:tcMar>
+              <w:top w:w="80" w:type="dxa"/>
+              <w:bottom w:w="80" w:type="dxa"/>
+              <w:left w:w="100" w:type="dxa"/>
+              <w:right w:w="100" w:type="dxa"/>
+            </w:tcMar>
+          </w:tcPr>
+          <w:p>
+            <w:r>
+              <w:rPr>
+                <w:sz w:val="18"/>
+              </w:rPr>
+              <w:t>Publish governance events to Cloud Pub/Sub, serving real-time Server-Sent Events (SSE) to the dashboard.</w:t>
+            </w:r>
+          </w:p>
+        </w:tc>
+      </w:tr>
+      <w:tr>
+        <w:tc>
+          <w:tcPr>
+            <w:tcW w:type="dxa" w:w="3168"/>
+            <w:shd w:fill="FFFFFF"/>
+            <w:tcMar>
+              <w:top w:w="80" w:type="dxa"/>
+              <w:bottom w:w="80" w:type="dxa"/>
+              <w:left w:w="100" w:type="dxa"/>
+              <w:right w:w="100" w:type="dxa"/>
+            </w:tcMar>
+          </w:tcPr>
+          <w:p>
+            <w:r>
+              <w:rPr>
+                <w:b/>
+                <w:sz w:val="18"/>
+              </w:rPr>
+              <w:t>Phase 5.2: OpenTelemetry Distributed Tracing</w:t>
+            </w:r>
+          </w:p>
+        </w:tc>
+        <w:tc>
+          <w:tcPr>
+            <w:tcW w:type="dxa" w:w="6192"/>
+            <w:shd w:fill="FFFFFF"/>
+            <w:tcMar>
+              <w:top w:w="80" w:type="dxa"/>
+              <w:bottom w:w="80" w:type="dxa"/>
+              <w:left w:w="100" w:type="dxa"/>
+              <w:right w:w="100" w:type="dxa"/>
+            </w:tcMar>
+          </w:tcPr>
+          <w:p>
+            <w:r>
+              <w:rPr>
+                <w:sz w:val="18"/>
+              </w:rPr>
+              <w:t>Pass traceparent headers down inter-agent hops, exporting metrics to Cloud Trace &amp; Cloud Monitoring.</w:t>
+            </w:r>
+          </w:p>
+        </w:tc>
+      </w:tr>
+      <w:tr>
+        <w:tc>
+          <w:tcPr>
+            <w:tcW w:type="dxa" w:w="3168"/>
+            <w:shd w:fill="F8F9FA"/>
+            <w:tcMar>
+              <w:top w:w="80" w:type="dxa"/>
+              <w:bottom w:w="80" w:type="dxa"/>
+              <w:left w:w="100" w:type="dxa"/>
+              <w:right w:w="100" w:type="dxa"/>
+            </w:tcMar>
+          </w:tcPr>
+          <w:p>
+            <w:r>
+              <w:rPr>
+                <w:b/>
+                <w:sz w:val="18"/>
+              </w:rPr>
+              <w:t>Phase 5.3: What-If Shock Simulator Integration</w:t>
+            </w:r>
+          </w:p>
+        </w:tc>
+        <w:tc>
+          <w:tcPr>
+            <w:tcW w:type="dxa" w:w="6192"/>
+            <w:shd w:fill="F8F9FA"/>
+            <w:tcMar>
+              <w:top w:w="80" w:type="dxa"/>
+              <w:bottom w:w="80" w:type="dxa"/>
+              <w:left w:w="100" w:type="dxa"/>
+              <w:right w:w="100" w:type="dxa"/>
+            </w:tcMar>
+          </w:tcPr>
+          <w:p>
+            <w:r>
+              <w:rPr>
+                <w:sz w:val="18"/>
+              </w:rPr>
+              <w:t>Stress-test policy thresholds under simulated traffic spikes (+10% to +50%).</w:t>
+            </w:r>
+          </w:p>
+        </w:tc>
+      </w:tr>
+    </w:tbl>
+    <w:p>
+      <w:pPr>
+        <w:spacing w:after="240"/>
+      </w:pPr>
+    </w:p>
+    <w:p>
+      <w:pPr>
+        <w:spacing w:before="280" w:after="80"/>
+      </w:pPr>
+      <w:r>
+        <w:rPr>
+          <w:b/>
+          <w:color w:val="1A73E8"/>
+          <w:sz w:val="26"/>
+        </w:rPr>
+        <w:t>Feature 6: Multi-Agent Network Policy Intercept &amp; Staging Deployment</w:t>
+      </w:r>
+    </w:p>
+    <w:p>
+      <w:pPr>
+        <w:spacing w:after="160"/>
+      </w:pPr>
+      <w:r>
+        <w:t>Manages inter-agent message policy interception across Orchestrator, TimesFM 2.0, BQML, and Chatbot agents operating under GCP Service Account identities.</w:t>
+      </w:r>
+    </w:p>
+    <w:p>
+      <w:pPr>
+        <w:spacing w:before="80" w:after="80"/>
+        <w:jc w:val="center"/>
+      </w:pPr>
+      <w:r>
+        <w:drawing>
+          <wp:inline xmlns:a="http://schemas.openxmlformats.org/drawingml/2006/main" xmlns:pic="http://schemas.openxmlformats.org/drawingml/2006/picture">
+            <wp:extent cx="5486400" cy="3429000"/>
+            <wp:docPr id="6" name="Picture 6"/>
+            <wp:cNvGraphicFramePr>
+              <a:graphicFrameLocks noChangeAspect="1"/>
+            </wp:cNvGraphicFramePr>
+            <a:graphic>
+              <a:graphicData uri="http://schemas.openxmlformats.org/drawingml/2006/picture">
+                <pic:pic>
+                  <pic:nvPicPr>
+                    <pic:cNvPr id="0" name="app_agentic.png"/>
+                    <pic:cNvPicPr/>
+                  </pic:nvPicPr>
+                  <pic:blipFill>
+                    <a:blip r:embed="rId14"/>
+                    <a:stretch>
+                      <a:fillRect/>
+                    </a:stretch>
+                  </pic:blipFill>
+                  <pic:spPr>
+                    <a:xfrm>
+                      <a:off x="0" y="0"/>
+                      <a:ext cx="5486400" cy="3429000"/>
+                    </a:xfrm>
+                    <a:prstGeom prst="rect"/>
+                  </pic:spPr>
+                </pic:pic>
+              </a:graphicData>
+            </a:graphic>
+          </wp:inline>
+        </w:drawing>
+      </w:r>
+    </w:p>
+    <w:p>
+      <w:pPr>
+        <w:spacing w:after="200"/>
+        <w:jc w:val="center"/>
+      </w:pPr>
+      <w:r>
+        <w:rPr>
+          <w:i/>
+          <w:color w:val="5F6368"/>
+          <w:sz w:val="18"/>
+        </w:rPr>
+        <w:t>Figure 6: Live Application Screenshot from http://localhost:8081/?tab=agentic — Agentic Hub Multi-Agent Registry &amp; Interagent Policy Console</w:t>
+      </w:r>
+    </w:p>
+    <w:tbl>
+      <w:tblPr>
+        <w:tblW w:type="auto" w:w="0"/>
+        <w:jc w:val="center"/>
+        <w:tblLayout w:type="fixed"/>
+        <w:tblLook w:firstColumn="1" w:firstRow="1" w:lastColumn="0" w:lastRow="0" w:noHBand="0" w:noVBand="1" w:val="04A0"/>
+      </w:tblPr>
+      <w:tblGrid>
+        <w:gridCol w:w="4968"/>
+        <w:gridCol w:w="4968"/>
+      </w:tblGrid>
+      <w:tr>
+        <w:tc>
+          <w:tcPr>
+            <w:tcW w:type="dxa" w:w="3168"/>
+            <w:shd w:fill="1A73E8"/>
+            <w:tcMar>
+              <w:top w:w="80" w:type="dxa"/>
+              <w:bottom w:w="80" w:type="dxa"/>
+              <w:left w:w="100" w:type="dxa"/>
+              <w:right w:w="100" w:type="dxa"/>
+            </w:tcMar>
+          </w:tcPr>
+          <w:p>
+            <w:r>
+              <w:rPr>
+                <w:b/>
+                <w:color w:val="FFFFFF"/>
+                <w:sz w:val="19"/>
+              </w:rPr>
+              <w:t>Policy Milestone</w:t>
+            </w:r>
+          </w:p>
+        </w:tc>
+        <w:tc>
+          <w:tcPr>
+            <w:tcW w:type="dxa" w:w="6192"/>
+            <w:shd w:fill="1A73E8"/>
+            <w:tcMar>
+              <w:top w:w="80" w:type="dxa"/>
+              <w:bottom w:w="80" w:type="dxa"/>
+              <w:left w:w="100" w:type="dxa"/>
+              <w:right w:w="100" w:type="dxa"/>
+            </w:tcMar>
+          </w:tcPr>
+          <w:p>
+            <w:r>
+              <w:rPr>
+                <w:b/>
+                <w:color w:val="FFFFFF"/>
+                <w:sz w:val="19"/>
+              </w:rPr>
+              <w:t>Deliverables &amp; Regulatory Verification</w:t>
+            </w:r>
+          </w:p>
+        </w:tc>
+      </w:tr>
+      <w:tr>
+        <w:tc>
+          <w:tcPr>
+            <w:tcW w:type="dxa" w:w="3168"/>
+            <w:shd w:fill="F8F9FA"/>
+            <w:tcMar>
+              <w:top w:w="80" w:type="dxa"/>
+              <w:bottom w:w="80" w:type="dxa"/>
+              <w:left w:w="100" w:type="dxa"/>
+              <w:right w:w="100" w:type="dxa"/>
+            </w:tcMar>
+          </w:tcPr>
+          <w:p>
+            <w:r>
+              <w:rPr>
+                <w:b/>
+                <w:sz w:val="18"/>
+              </w:rPr>
+              <w:t>Phase 6.1: Service Account Workload Identity Binding</w:t>
+            </w:r>
+          </w:p>
+        </w:tc>
+        <w:tc>
+          <w:tcPr>
+            <w:tcW w:type="dxa" w:w="6192"/>
+            <w:shd w:fill="F8F9FA"/>
+            <w:tcMar>
+              <w:top w:w="80" w:type="dxa"/>
+              <w:bottom w:w="80" w:type="dxa"/>
+              <w:left w:w="100" w:type="dxa"/>
+              <w:right w:w="100" w:type="dxa"/>
+            </w:tcMar>
+          </w:tcPr>
+          <w:p>
+            <w:r>
+              <w:rPr>
+                <w:sz w:val="18"/>
+              </w:rPr>
+              <w:t>Bind agents to dedicated Service Accounts (sa:fusion-ai-*) with granular GCP IAM roles.</w:t>
+            </w:r>
+          </w:p>
+        </w:tc>
+      </w:tr>
+      <w:tr>
+        <w:tc>
+          <w:tcPr>
+            <w:tcW w:type="dxa" w:w="3168"/>
+            <w:shd w:fill="FFFFFF"/>
+            <w:tcMar>
+              <w:top w:w="80" w:type="dxa"/>
+              <w:bottom w:w="80" w:type="dxa"/>
+              <w:left w:w="100" w:type="dxa"/>
+              <w:right w:w="100" w:type="dxa"/>
+            </w:tcMar>
+          </w:tcPr>
+          <w:p>
+            <w:r>
+              <w:rPr>
+                <w:b/>
+                <w:sz w:val="18"/>
+              </w:rPr>
+              <w:t>Phase 6.2: Inter-Agent Communication Intercept</w:t>
+            </w:r>
+          </w:p>
+        </w:tc>
+        <w:tc>
+          <w:tcPr>
+            <w:tcW w:type="dxa" w:w="6192"/>
+            <w:shd w:fill="FFFFFF"/>
+            <w:tcMar>
+              <w:top w:w="80" w:type="dxa"/>
+              <w:bottom w:w="80" w:type="dxa"/>
+              <w:left w:w="100" w:type="dxa"/>
+              <w:right w:w="100" w:type="dxa"/>
+            </w:tcMar>
+          </w:tcPr>
+          <w:p>
+            <w:r>
+              <w:rPr>
+                <w:sz w:val="18"/>
+              </w:rPr>
+              <w:t>Inspect inter-agent message payloads for policy violations and credential leaks before delegating actions.</w:t>
+            </w:r>
+          </w:p>
+        </w:tc>
+      </w:tr>
+      <w:tr>
+        <w:tc>
+          <w:tcPr>
+            <w:tcW w:type="dxa" w:w="3168"/>
+            <w:shd w:fill="F8F9FA"/>
+            <w:tcMar>
+              <w:top w:w="80" w:type="dxa"/>
+              <w:bottom w:w="80" w:type="dxa"/>
+              <w:left w:w="100" w:type="dxa"/>
+              <w:right w:w="100" w:type="dxa"/>
+            </w:tcMar>
+          </w:tcPr>
+          <w:p>
+            <w:r>
+              <w:rPr>
+                <w:b/>
+                <w:sz w:val="18"/>
+              </w:rPr>
+              <w:t>Phase 6.3: Production Canary Rollout</w:t>
+            </w:r>
+          </w:p>
+        </w:tc>
+        <w:tc>
+          <w:tcPr>
+            <w:tcW w:type="dxa" w:w="6192"/>
+            <w:shd w:fill="F8F9FA"/>
+            <w:tcMar>
+              <w:top w:w="80" w:type="dxa"/>
+              <w:bottom w:w="80" w:type="dxa"/>
+              <w:left w:w="100" w:type="dxa"/>
+              <w:right w:w="100" w:type="dxa"/>
+            </w:tcMar>
+          </w:tcPr>
+          <w:p>
+            <w:r>
+              <w:rPr>
+                <w:sz w:val="18"/>
+              </w:rPr>
+              <w:t>Deploy Policy Gateway to Cloud Run / GKE with traffic splitting (10% -&gt; 50% -&gt; 100%).</w:t>
             </w:r>
           </w:p>
         </w:tc>

</xml_diff>

<commit_message>
Update formal Agent Policy & Regulatory Compliance Specification Word document (.docx)
</commit_message>
<xml_diff>
--- a/Agent_Policy_and_Regulatory_Compliance_Specification.docx
+++ b/Agent_Policy_and_Regulatory_Compliance_Specification.docx
@@ -27,7 +27,7 @@
           <w:color w:val="5F6368"/>
           <w:sz w:val="23"/>
         </w:rPr>
-        <w:t>Regulatory Enforcement Architecture &amp; Live Application Screenshots (http://localhost:8081/)</w:t>
+        <w:t>Enterprise Policy Engine &amp; Multi-Framework Governance Standard</w:t>
         <w:br/>
         <w:t>Google AI Ecosystem — Gemini Enterprise Agent Platform</w:t>
       </w:r>
@@ -90,7 +90,7 @@
                 <w:color w:val="3C4043"/>
                 <w:sz w:val="19"/>
               </w:rPr>
-              <w:t>Agent Policy Engine, Regulatory Compliance, PII/PHI Redaction, Cryptographic Auditing</w:t>
+              <w:t>Agent Policy Engine, Regulatory Compliance, Data Privacy, Cryptographic Audit Trails</w:t>
             </w:r>
           </w:p>
         </w:tc>
@@ -117,7 +117,7 @@
                 <w:color w:val="3C4043"/>
                 <w:sz w:val="19"/>
               </w:rPr>
-              <w:t>Regulatory Frameworks:</w:t>
+              <w:t>Regulatory Scope:</w:t>
             </w:r>
           </w:p>
         </w:tc>
@@ -142,7 +142,7 @@
                 <w:color w:val="3C4043"/>
                 <w:sz w:val="19"/>
               </w:rPr>
-              <w:t>HIPAA (US), SOC 2 Type II, EU GDPR (Art. 17), India DPDP Act 2023, Gemini Trust</w:t>
+              <w:t>HIPAA (US), SOC 2 Type II, EU GDPR (Art. 17/32), India DPDP Act 2023, Gemini Trust Platform</w:t>
             </w:r>
           </w:p>
         </w:tc>
@@ -169,7 +169,7 @@
                 <w:color w:val="3C4043"/>
                 <w:sz w:val="19"/>
               </w:rPr>
-              <w:t>Screenshot Source:</w:t>
+              <w:t>Platform Architecture:</w:t>
             </w:r>
           </w:p>
         </w:tc>
@@ -194,7 +194,7 @@
                 <w:color w:val="3C4043"/>
                 <w:sz w:val="19"/>
               </w:rPr>
-              <w:t>Captured Live from Running Application at http://localhost:8081/</w:t>
+              <w:t>Gemini Enterprise Agent Platform, Cloud Run Policy Gateway, Cloud DLP, Cloud KMS, BigQuery</w:t>
             </w:r>
           </w:p>
         </w:tc>
@@ -215,7 +215,7 @@
           <w:color w:val="1A73E8"/>
           <w:sz w:val="30"/>
         </w:rPr>
-        <w:t>1. Executive Overview &amp; Agent Policy Architecture</w:t>
+        <w:t>Part I: Agent Policy Engine Specification</w:t>
       </w:r>
     </w:p>
     <w:p>
@@ -223,8 +223,660 @@
         <w:spacing w:after="200"/>
       </w:pPr>
       <w:r>
-        <w:t>This document defines the narrowed technical specification for the **Agent Policy and Compliance Engine** operating within the **Gemini Enterprise Agent Platform**. It focuses specifically on regulatory compliance guardrails, zero-trust inter-agent policy enforcement, and cryptographically verifiable audit trails required for enterprise compliance sign-off. All embedded screenshots in this document are captured directly from the live application at **http://localhost:8081/**.</w:t>
+        <w:t>The Agent Policy Engine operates as a zero-trust interception layer enforcing strict execution rules across all human-to-agent and agent-to-agent message flows. The table below defines the active policy rule catalog enforced by the gateway:</w:t>
       </w:r>
+    </w:p>
+    <w:tbl>
+      <w:tblPr>
+        <w:tblW w:type="auto" w:w="0"/>
+        <w:jc w:val="center"/>
+        <w:tblLayout w:type="fixed"/>
+        <w:tblLook w:firstColumn="1" w:firstRow="1" w:lastColumn="0" w:lastRow="0" w:noHBand="0" w:noVBand="1" w:val="04A0"/>
+      </w:tblPr>
+      <w:tblGrid>
+        <w:gridCol w:w="1987"/>
+        <w:gridCol w:w="1987"/>
+        <w:gridCol w:w="1987"/>
+        <w:gridCol w:w="1987"/>
+        <w:gridCol w:w="1987"/>
+      </w:tblGrid>
+      <w:tr>
+        <w:tc>
+          <w:tcPr>
+            <w:tcW w:type="dxa" w:w="1728"/>
+            <w:shd w:fill="1A73E8"/>
+            <w:tcMar>
+              <w:top w:w="80" w:type="dxa"/>
+              <w:bottom w:w="80" w:type="dxa"/>
+              <w:left w:w="80" w:type="dxa"/>
+              <w:right w:w="80" w:type="dxa"/>
+            </w:tcMar>
+          </w:tcPr>
+          <w:p>
+            <w:r>
+              <w:rPr>
+                <w:b/>
+                <w:color w:val="FFFFFF"/>
+                <w:sz w:val="18"/>
+              </w:rPr>
+              <w:t>Policy ID</w:t>
+            </w:r>
+          </w:p>
+        </w:tc>
+        <w:tc>
+          <w:tcPr>
+            <w:tcW w:type="dxa" w:w="2160"/>
+            <w:shd w:fill="1A73E8"/>
+            <w:tcMar>
+              <w:top w:w="80" w:type="dxa"/>
+              <w:bottom w:w="80" w:type="dxa"/>
+              <w:left w:w="80" w:type="dxa"/>
+              <w:right w:w="80" w:type="dxa"/>
+            </w:tcMar>
+          </w:tcPr>
+          <w:p>
+            <w:r>
+              <w:rPr>
+                <w:b/>
+                <w:color w:val="FFFFFF"/>
+                <w:sz w:val="18"/>
+              </w:rPr>
+              <w:t>Policy Rule Name</w:t>
+            </w:r>
+          </w:p>
+        </w:tc>
+        <w:tc>
+          <w:tcPr>
+            <w:tcW w:type="dxa" w:w="2160"/>
+            <w:shd w:fill="1A73E8"/>
+            <w:tcMar>
+              <w:top w:w="80" w:type="dxa"/>
+              <w:bottom w:w="80" w:type="dxa"/>
+              <w:left w:w="80" w:type="dxa"/>
+              <w:right w:w="80" w:type="dxa"/>
+            </w:tcMar>
+          </w:tcPr>
+          <w:p>
+            <w:r>
+              <w:rPr>
+                <w:b/>
+                <w:color w:val="FFFFFF"/>
+                <w:sz w:val="18"/>
+              </w:rPr>
+              <w:t>Target Risk / Entity Pattern</w:t>
+            </w:r>
+          </w:p>
+        </w:tc>
+        <w:tc>
+          <w:tcPr>
+            <w:tcW w:type="dxa" w:w="1296"/>
+            <w:shd w:fill="1A73E8"/>
+            <w:tcMar>
+              <w:top w:w="80" w:type="dxa"/>
+              <w:bottom w:w="80" w:type="dxa"/>
+              <w:left w:w="80" w:type="dxa"/>
+              <w:right w:w="80" w:type="dxa"/>
+            </w:tcMar>
+          </w:tcPr>
+          <w:p>
+            <w:r>
+              <w:rPr>
+                <w:b/>
+                <w:color w:val="FFFFFF"/>
+                <w:sz w:val="18"/>
+              </w:rPr>
+              <w:t>Action Enforced</w:t>
+            </w:r>
+          </w:p>
+        </w:tc>
+        <w:tc>
+          <w:tcPr>
+            <w:tcW w:type="dxa" w:w="2448"/>
+            <w:shd w:fill="1A73E8"/>
+            <w:tcMar>
+              <w:top w:w="80" w:type="dxa"/>
+              <w:bottom w:w="80" w:type="dxa"/>
+              <w:left w:w="80" w:type="dxa"/>
+              <w:right w:w="80" w:type="dxa"/>
+            </w:tcMar>
+          </w:tcPr>
+          <w:p>
+            <w:r>
+              <w:rPr>
+                <w:b/>
+                <w:color w:val="FFFFFF"/>
+                <w:sz w:val="18"/>
+              </w:rPr>
+              <w:t>Description &amp; Enforcement Scope</w:t>
+            </w:r>
+          </w:p>
+        </w:tc>
+      </w:tr>
+      <w:tr>
+        <w:tc>
+          <w:tcPr>
+            <w:tcW w:type="dxa" w:w="1728"/>
+            <w:shd w:fill="F8F9FA"/>
+            <w:tcMar>
+              <w:top w:w="60" w:type="dxa"/>
+              <w:bottom w:w="60" w:type="dxa"/>
+              <w:left w:w="60" w:type="dxa"/>
+              <w:right w:w="60" w:type="dxa"/>
+            </w:tcMar>
+          </w:tcPr>
+          <w:p>
+            <w:r>
+              <w:rPr>
+                <w:b/>
+                <w:sz w:val="17"/>
+              </w:rPr>
+              <w:t>HIPAA-PII-01</w:t>
+            </w:r>
+          </w:p>
+        </w:tc>
+        <w:tc>
+          <w:tcPr>
+            <w:tcW w:type="dxa" w:w="2160"/>
+            <w:shd w:fill="F8F9FA"/>
+            <w:tcMar>
+              <w:top w:w="60" w:type="dxa"/>
+              <w:bottom w:w="60" w:type="dxa"/>
+              <w:left w:w="60" w:type="dxa"/>
+              <w:right w:w="60" w:type="dxa"/>
+            </w:tcMar>
+          </w:tcPr>
+          <w:p>
+            <w:r>
+              <w:rPr>
+                <w:b/>
+                <w:sz w:val="17"/>
+              </w:rPr>
+              <w:t>PHI &amp; PII Masking Shield</w:t>
+            </w:r>
+          </w:p>
+        </w:tc>
+        <w:tc>
+          <w:tcPr>
+            <w:tcW w:type="dxa" w:w="2160"/>
+            <w:shd w:fill="F8F9FA"/>
+            <w:tcMar>
+              <w:top w:w="60" w:type="dxa"/>
+              <w:bottom w:w="60" w:type="dxa"/>
+              <w:left w:w="60" w:type="dxa"/>
+              <w:right w:w="60" w:type="dxa"/>
+            </w:tcMar>
+          </w:tcPr>
+          <w:p>
+            <w:r>
+              <w:rPr>
+                <w:sz w:val="17"/>
+              </w:rPr>
+              <w:t>SSN, Phone, Email, MRN (MRN-\d{6})</w:t>
+            </w:r>
+          </w:p>
+        </w:tc>
+        <w:tc>
+          <w:tcPr>
+            <w:tcW w:type="dxa" w:w="1296"/>
+            <w:shd w:fill="F8F9FA"/>
+            <w:tcMar>
+              <w:top w:w="60" w:type="dxa"/>
+              <w:bottom w:w="60" w:type="dxa"/>
+              <w:left w:w="60" w:type="dxa"/>
+              <w:right w:w="60" w:type="dxa"/>
+            </w:tcMar>
+          </w:tcPr>
+          <w:p>
+            <w:r>
+              <w:rPr>
+                <w:sz w:val="17"/>
+              </w:rPr>
+              <w:t>Mask (Redact)</w:t>
+            </w:r>
+          </w:p>
+        </w:tc>
+        <w:tc>
+          <w:tcPr>
+            <w:tcW w:type="dxa" w:w="2448"/>
+            <w:shd w:fill="F8F9FA"/>
+            <w:tcMar>
+              <w:top w:w="60" w:type="dxa"/>
+              <w:bottom w:w="60" w:type="dxa"/>
+              <w:left w:w="60" w:type="dxa"/>
+              <w:right w:w="60" w:type="dxa"/>
+            </w:tcMar>
+          </w:tcPr>
+          <w:p>
+            <w:r>
+              <w:rPr>
+                <w:sz w:val="17"/>
+              </w:rPr>
+              <w:t>Redacts Medical Record Numbers and sensitive identifiers prior to model ingress under HIPAA §164.312.</w:t>
+            </w:r>
+          </w:p>
+        </w:tc>
+      </w:tr>
+      <w:tr>
+        <w:tc>
+          <w:tcPr>
+            <w:tcW w:type="dxa" w:w="1728"/>
+            <w:shd w:fill="FFFFFF"/>
+            <w:tcMar>
+              <w:top w:w="60" w:type="dxa"/>
+              <w:bottom w:w="60" w:type="dxa"/>
+              <w:left w:w="60" w:type="dxa"/>
+              <w:right w:w="60" w:type="dxa"/>
+            </w:tcMar>
+          </w:tcPr>
+          <w:p>
+            <w:r>
+              <w:rPr>
+                <w:b/>
+                <w:sz w:val="17"/>
+              </w:rPr>
+              <w:t>DPDP-AADHAAR-02</w:t>
+            </w:r>
+          </w:p>
+        </w:tc>
+        <w:tc>
+          <w:tcPr>
+            <w:tcW w:type="dxa" w:w="2160"/>
+            <w:shd w:fill="FFFFFF"/>
+            <w:tcMar>
+              <w:top w:w="60" w:type="dxa"/>
+              <w:bottom w:w="60" w:type="dxa"/>
+              <w:left w:w="60" w:type="dxa"/>
+              <w:right w:w="60" w:type="dxa"/>
+            </w:tcMar>
+          </w:tcPr>
+          <w:p>
+            <w:r>
+              <w:rPr>
+                <w:b/>
+                <w:sz w:val="17"/>
+              </w:rPr>
+              <w:t>Indian Aadhaar Masking</w:t>
+            </w:r>
+          </w:p>
+        </w:tc>
+        <w:tc>
+          <w:tcPr>
+            <w:tcW w:type="dxa" w:w="2160"/>
+            <w:shd w:fill="FFFFFF"/>
+            <w:tcMar>
+              <w:top w:w="60" w:type="dxa"/>
+              <w:bottom w:w="60" w:type="dxa"/>
+              <w:left w:w="60" w:type="dxa"/>
+              <w:right w:w="60" w:type="dxa"/>
+            </w:tcMar>
+          </w:tcPr>
+          <w:p>
+            <w:r>
+              <w:rPr>
+                <w:sz w:val="17"/>
+              </w:rPr>
+              <w:t>\b\d{4}-\d{4}-\d{4}\b</w:t>
+            </w:r>
+          </w:p>
+        </w:tc>
+        <w:tc>
+          <w:tcPr>
+            <w:tcW w:type="dxa" w:w="1296"/>
+            <w:shd w:fill="FFFFFF"/>
+            <w:tcMar>
+              <w:top w:w="60" w:type="dxa"/>
+              <w:bottom w:w="60" w:type="dxa"/>
+              <w:left w:w="60" w:type="dxa"/>
+              <w:right w:w="60" w:type="dxa"/>
+            </w:tcMar>
+          </w:tcPr>
+          <w:p>
+            <w:r>
+              <w:rPr>
+                <w:sz w:val="17"/>
+              </w:rPr>
+              <w:t>Mask (Redact)</w:t>
+            </w:r>
+          </w:p>
+        </w:tc>
+        <w:tc>
+          <w:tcPr>
+            <w:tcW w:type="dxa" w:w="2448"/>
+            <w:shd w:fill="FFFFFF"/>
+            <w:tcMar>
+              <w:top w:w="60" w:type="dxa"/>
+              <w:bottom w:w="60" w:type="dxa"/>
+              <w:left w:w="60" w:type="dxa"/>
+              <w:right w:w="60" w:type="dxa"/>
+            </w:tcMar>
+          </w:tcPr>
+          <w:p>
+            <w:r>
+              <w:rPr>
+                <w:sz w:val="17"/>
+              </w:rPr>
+              <w:t>Detects and redacts 12-digit Indian Aadhaar card numbers to comply with Section 8 of India's DPDP Act 2023.</w:t>
+            </w:r>
+          </w:p>
+        </w:tc>
+      </w:tr>
+      <w:tr>
+        <w:tc>
+          <w:tcPr>
+            <w:tcW w:type="dxa" w:w="1728"/>
+            <w:shd w:fill="F8F9FA"/>
+            <w:tcMar>
+              <w:top w:w="60" w:type="dxa"/>
+              <w:bottom w:w="60" w:type="dxa"/>
+              <w:left w:w="60" w:type="dxa"/>
+              <w:right w:w="60" w:type="dxa"/>
+            </w:tcMar>
+          </w:tcPr>
+          <w:p>
+            <w:r>
+              <w:rPr>
+                <w:b/>
+                <w:sz w:val="17"/>
+              </w:rPr>
+              <w:t>PROMPT-INJ-03</w:t>
+            </w:r>
+          </w:p>
+        </w:tc>
+        <w:tc>
+          <w:tcPr>
+            <w:tcW w:type="dxa" w:w="2160"/>
+            <w:shd w:fill="F8F9FA"/>
+            <w:tcMar>
+              <w:top w:w="60" w:type="dxa"/>
+              <w:bottom w:w="60" w:type="dxa"/>
+              <w:left w:w="60" w:type="dxa"/>
+              <w:right w:w="60" w:type="dxa"/>
+            </w:tcMar>
+          </w:tcPr>
+          <w:p>
+            <w:r>
+              <w:rPr>
+                <w:b/>
+                <w:sz w:val="17"/>
+              </w:rPr>
+              <w:t>Prompt Injection Shield</w:t>
+            </w:r>
+          </w:p>
+        </w:tc>
+        <w:tc>
+          <w:tcPr>
+            <w:tcW w:type="dxa" w:w="2160"/>
+            <w:shd w:fill="F8F9FA"/>
+            <w:tcMar>
+              <w:top w:w="60" w:type="dxa"/>
+              <w:bottom w:w="60" w:type="dxa"/>
+              <w:left w:w="60" w:type="dxa"/>
+              <w:right w:w="60" w:type="dxa"/>
+            </w:tcMar>
+          </w:tcPr>
+          <w:p>
+            <w:r>
+              <w:rPr>
+                <w:sz w:val="17"/>
+              </w:rPr>
+              <w:t>ignore previous|system prompt|bypass filter|override</w:t>
+            </w:r>
+          </w:p>
+        </w:tc>
+        <w:tc>
+          <w:tcPr>
+            <w:tcW w:type="dxa" w:w="1296"/>
+            <w:shd w:fill="F8F9FA"/>
+            <w:tcMar>
+              <w:top w:w="60" w:type="dxa"/>
+              <w:bottom w:w="60" w:type="dxa"/>
+              <w:left w:w="60" w:type="dxa"/>
+              <w:right w:w="60" w:type="dxa"/>
+            </w:tcMar>
+          </w:tcPr>
+          <w:p>
+            <w:r>
+              <w:rPr>
+                <w:sz w:val="17"/>
+              </w:rPr>
+              <w:t>Block Prompt</w:t>
+            </w:r>
+          </w:p>
+        </w:tc>
+        <w:tc>
+          <w:tcPr>
+            <w:tcW w:type="dxa" w:w="2448"/>
+            <w:shd w:fill="F8F9FA"/>
+            <w:tcMar>
+              <w:top w:w="60" w:type="dxa"/>
+              <w:bottom w:w="60" w:type="dxa"/>
+              <w:left w:w="60" w:type="dxa"/>
+              <w:right w:w="60" w:type="dxa"/>
+            </w:tcMar>
+          </w:tcPr>
+          <w:p>
+            <w:r>
+              <w:rPr>
+                <w:sz w:val="17"/>
+              </w:rPr>
+              <w:t>Intercepts adversarial prompts attempting to override developer guidelines or hijack agent execution loops.</w:t>
+            </w:r>
+          </w:p>
+        </w:tc>
+      </w:tr>
+      <w:tr>
+        <w:tc>
+          <w:tcPr>
+            <w:tcW w:type="dxa" w:w="1728"/>
+            <w:shd w:fill="FFFFFF"/>
+            <w:tcMar>
+              <w:top w:w="60" w:type="dxa"/>
+              <w:bottom w:w="60" w:type="dxa"/>
+              <w:left w:w="60" w:type="dxa"/>
+              <w:right w:w="60" w:type="dxa"/>
+            </w:tcMar>
+          </w:tcPr>
+          <w:p>
+            <w:r>
+              <w:rPr>
+                <w:b/>
+                <w:sz w:val="17"/>
+              </w:rPr>
+              <w:t>TOOL-LOCK-04</w:t>
+            </w:r>
+          </w:p>
+        </w:tc>
+        <w:tc>
+          <w:tcPr>
+            <w:tcW w:type="dxa" w:w="2160"/>
+            <w:shd w:fill="FFFFFF"/>
+            <w:tcMar>
+              <w:top w:w="60" w:type="dxa"/>
+              <w:bottom w:w="60" w:type="dxa"/>
+              <w:left w:w="60" w:type="dxa"/>
+              <w:right w:w="60" w:type="dxa"/>
+            </w:tcMar>
+          </w:tcPr>
+          <w:p>
+            <w:r>
+              <w:rPr>
+                <w:b/>
+                <w:sz w:val="17"/>
+              </w:rPr>
+              <w:t>Tool Command Lockout</w:t>
+            </w:r>
+          </w:p>
+        </w:tc>
+        <w:tc>
+          <w:tcPr>
+            <w:tcW w:type="dxa" w:w="2160"/>
+            <w:shd w:fill="FFFFFF"/>
+            <w:tcMar>
+              <w:top w:w="60" w:type="dxa"/>
+              <w:bottom w:w="60" w:type="dxa"/>
+              <w:left w:w="60" w:type="dxa"/>
+              <w:right w:w="60" w:type="dxa"/>
+            </w:tcMar>
+          </w:tcPr>
+          <w:p>
+            <w:r>
+              <w:rPr>
+                <w:sz w:val="17"/>
+              </w:rPr>
+              <w:t>execute_bash|rm -rf|delete_database|outbound_ping</w:t>
+            </w:r>
+          </w:p>
+        </w:tc>
+        <w:tc>
+          <w:tcPr>
+            <w:tcW w:type="dxa" w:w="1296"/>
+            <w:shd w:fill="FFFFFF"/>
+            <w:tcMar>
+              <w:top w:w="60" w:type="dxa"/>
+              <w:bottom w:w="60" w:type="dxa"/>
+              <w:left w:w="60" w:type="dxa"/>
+              <w:right w:w="60" w:type="dxa"/>
+            </w:tcMar>
+          </w:tcPr>
+          <w:p>
+            <w:r>
+              <w:rPr>
+                <w:sz w:val="17"/>
+              </w:rPr>
+              <w:t>Block Tool</w:t>
+            </w:r>
+          </w:p>
+        </w:tc>
+        <w:tc>
+          <w:tcPr>
+            <w:tcW w:type="dxa" w:w="2448"/>
+            <w:shd w:fill="FFFFFF"/>
+            <w:tcMar>
+              <w:top w:w="60" w:type="dxa"/>
+              <w:bottom w:w="60" w:type="dxa"/>
+              <w:left w:w="60" w:type="dxa"/>
+              <w:right w:w="60" w:type="dxa"/>
+            </w:tcMar>
+          </w:tcPr>
+          <w:p>
+            <w:r>
+              <w:rPr>
+                <w:sz w:val="17"/>
+              </w:rPr>
+              <w:t>Neutralizes unauthorized tool call parameters containing destructive shell injection or database commands.</w:t>
+            </w:r>
+          </w:p>
+        </w:tc>
+      </w:tr>
+      <w:tr>
+        <w:tc>
+          <w:tcPr>
+            <w:tcW w:type="dxa" w:w="1728"/>
+            <w:shd w:fill="F8F9FA"/>
+            <w:tcMar>
+              <w:top w:w="60" w:type="dxa"/>
+              <w:bottom w:w="60" w:type="dxa"/>
+              <w:left w:w="60" w:type="dxa"/>
+              <w:right w:w="60" w:type="dxa"/>
+            </w:tcMar>
+          </w:tcPr>
+          <w:p>
+            <w:r>
+              <w:rPr>
+                <w:b/>
+                <w:sz w:val="17"/>
+              </w:rPr>
+              <w:t>GDPR-ERASURE-05</w:t>
+            </w:r>
+          </w:p>
+        </w:tc>
+        <w:tc>
+          <w:tcPr>
+            <w:tcW w:type="dxa" w:w="2160"/>
+            <w:shd w:fill="F8F9FA"/>
+            <w:tcMar>
+              <w:top w:w="60" w:type="dxa"/>
+              <w:bottom w:w="60" w:type="dxa"/>
+              <w:left w:w="60" w:type="dxa"/>
+              <w:right w:w="60" w:type="dxa"/>
+            </w:tcMar>
+          </w:tcPr>
+          <w:p>
+            <w:r>
+              <w:rPr>
+                <w:b/>
+                <w:sz w:val="17"/>
+              </w:rPr>
+              <w:t>Right to Erasure Filter</w:t>
+            </w:r>
+          </w:p>
+        </w:tc>
+        <w:tc>
+          <w:tcPr>
+            <w:tcW w:type="dxa" w:w="2160"/>
+            <w:shd w:fill="F8F9FA"/>
+            <w:tcMar>
+              <w:top w:w="60" w:type="dxa"/>
+              <w:bottom w:w="60" w:type="dxa"/>
+              <w:left w:w="60" w:type="dxa"/>
+              <w:right w:w="60" w:type="dxa"/>
+            </w:tcMar>
+          </w:tcPr>
+          <w:p>
+            <w:r>
+              <w:rPr>
+                <w:sz w:val="17"/>
+              </w:rPr>
+              <w:t>forget me|delete data|erase account|gdpr art 17</w:t>
+            </w:r>
+          </w:p>
+        </w:tc>
+        <w:tc>
+          <w:tcPr>
+            <w:tcW w:type="dxa" w:w="1296"/>
+            <w:shd w:fill="F8F9FA"/>
+            <w:tcMar>
+              <w:top w:w="60" w:type="dxa"/>
+              <w:bottom w:w="60" w:type="dxa"/>
+              <w:left w:w="60" w:type="dxa"/>
+              <w:right w:w="60" w:type="dxa"/>
+            </w:tcMar>
+          </w:tcPr>
+          <w:p>
+            <w:r>
+              <w:rPr>
+                <w:sz w:val="17"/>
+              </w:rPr>
+              <w:t>Flag &amp; Purge</w:t>
+            </w:r>
+          </w:p>
+        </w:tc>
+        <w:tc>
+          <w:tcPr>
+            <w:tcW w:type="dxa" w:w="2448"/>
+            <w:shd w:fill="F8F9FA"/>
+            <w:tcMar>
+              <w:top w:w="60" w:type="dxa"/>
+              <w:bottom w:w="60" w:type="dxa"/>
+              <w:left w:w="60" w:type="dxa"/>
+              <w:right w:w="60" w:type="dxa"/>
+            </w:tcMar>
+          </w:tcPr>
+          <w:p>
+            <w:r>
+              <w:rPr>
+                <w:sz w:val="17"/>
+              </w:rPr>
+              <w:t>Flags data removal requests for systematic purge, enforcing EU GDPR Article 17 (Right to Erasure).</w:t>
+            </w:r>
+          </w:p>
+        </w:tc>
+      </w:tr>
+    </w:tbl>
+    <w:p>
+      <w:pPr>
+        <w:spacing w:after="280"/>
+      </w:pPr>
     </w:p>
     <w:p>
       <w:pPr>
@@ -236,7 +888,7 @@
           <w:color w:val="1A73E8"/>
           <w:sz w:val="30"/>
         </w:rPr>
-        <w:t>2. Multi-Framework Regulatory Compliance Enforcement Matrix</w:t>
+        <w:t>Part II: Multi-Framework Regulatory Governance Mapping</w:t>
       </w:r>
     </w:p>
     <w:tbl>
@@ -258,10 +910,10 @@
             <w:tcW w:type="dxa" w:w="2160"/>
             <w:shd w:fill="1A73E8"/>
             <w:tcMar>
-              <w:top w:w="100" w:type="dxa"/>
-              <w:bottom w:w="100" w:type="dxa"/>
-              <w:left w:w="100" w:type="dxa"/>
-              <w:right w:w="100" w:type="dxa"/>
+              <w:top w:w="80" w:type="dxa"/>
+              <w:bottom w:w="80" w:type="dxa"/>
+              <w:left w:w="80" w:type="dxa"/>
+              <w:right w:w="80" w:type="dxa"/>
             </w:tcMar>
           </w:tcPr>
           <w:p>
@@ -269,21 +921,21 @@
               <w:rPr>
                 <w:b/>
                 <w:color w:val="FFFFFF"/>
-                <w:sz w:val="19"/>
+                <w:sz w:val="18"/>
               </w:rPr>
-              <w:t>Regulatory Framework</w:t>
+              <w:t>Regulatory Standard</w:t>
             </w:r>
           </w:p>
         </w:tc>
         <w:tc>
           <w:tcPr>
-            <w:tcW w:type="dxa" w:w="2592"/>
+            <w:tcW w:type="dxa" w:w="2448"/>
             <w:shd w:fill="1A73E8"/>
             <w:tcMar>
-              <w:top w:w="100" w:type="dxa"/>
-              <w:bottom w:w="100" w:type="dxa"/>
-              <w:left w:w="100" w:type="dxa"/>
-              <w:right w:w="100" w:type="dxa"/>
+              <w:top w:w="80" w:type="dxa"/>
+              <w:bottom w:w="80" w:type="dxa"/>
+              <w:left w:w="80" w:type="dxa"/>
+              <w:right w:w="80" w:type="dxa"/>
             </w:tcMar>
           </w:tcPr>
           <w:p>
@@ -291,21 +943,21 @@
               <w:rPr>
                 <w:b/>
                 <w:color w:val="FFFFFF"/>
-                <w:sz w:val="19"/>
+                <w:sz w:val="18"/>
               </w:rPr>
-              <w:t>Mandated Legal Standard</w:t>
+              <w:t>Legal Clause / Mandatory Requirement</w:t>
             </w:r>
           </w:p>
         </w:tc>
         <w:tc>
           <w:tcPr>
-            <w:tcW w:type="dxa" w:w="2880"/>
+            <w:tcW w:type="dxa" w:w="3168"/>
             <w:shd w:fill="1A73E8"/>
             <w:tcMar>
-              <w:top w:w="100" w:type="dxa"/>
-              <w:bottom w:w="100" w:type="dxa"/>
-              <w:left w:w="100" w:type="dxa"/>
-              <w:right w:w="100" w:type="dxa"/>
+              <w:top w:w="80" w:type="dxa"/>
+              <w:bottom w:w="80" w:type="dxa"/>
+              <w:left w:w="80" w:type="dxa"/>
+              <w:right w:w="80" w:type="dxa"/>
             </w:tcMar>
           </w:tcPr>
           <w:p>
@@ -313,21 +965,21 @@
               <w:rPr>
                 <w:b/>
                 <w:color w:val="FFFFFF"/>
-                <w:sz w:val="19"/>
+                <w:sz w:val="18"/>
               </w:rPr>
-              <w:t>Agent Policy Engine Control Mechanism</w:t>
+              <w:t>Policy Engine Control Mechanism</w:t>
             </w:r>
           </w:p>
         </w:tc>
         <w:tc>
           <w:tcPr>
-            <w:tcW w:type="dxa" w:w="2160"/>
+            <w:tcW w:type="dxa" w:w="2016"/>
             <w:shd w:fill="1A73E8"/>
             <w:tcMar>
-              <w:top w:w="100" w:type="dxa"/>
-              <w:bottom w:w="100" w:type="dxa"/>
-              <w:left w:w="100" w:type="dxa"/>
-              <w:right w:w="100" w:type="dxa"/>
+              <w:top w:w="80" w:type="dxa"/>
+              <w:bottom w:w="80" w:type="dxa"/>
+              <w:left w:w="80" w:type="dxa"/>
+              <w:right w:w="80" w:type="dxa"/>
             </w:tcMar>
           </w:tcPr>
           <w:p>
@@ -335,7 +987,7 @@
               <w:rPr>
                 <w:b/>
                 <w:color w:val="FFFFFF"/>
-                <w:sz w:val="19"/>
+                <w:sz w:val="18"/>
               </w:rPr>
               <w:t>GCP Native Binding</w:t>
             </w:r>
@@ -348,79 +1000,79 @@
             <w:tcW w:type="dxa" w:w="2160"/>
             <w:shd w:fill="F8F9FA"/>
             <w:tcMar>
-              <w:top w:w="80" w:type="dxa"/>
-              <w:bottom w:w="80" w:type="dxa"/>
-              <w:left w:w="80" w:type="dxa"/>
-              <w:right w:w="80" w:type="dxa"/>
+              <w:top w:w="60" w:type="dxa"/>
+              <w:bottom w:w="60" w:type="dxa"/>
+              <w:left w:w="60" w:type="dxa"/>
+              <w:right w:w="60" w:type="dxa"/>
             </w:tcMar>
           </w:tcPr>
           <w:p>
             <w:r>
               <w:rPr>
                 <w:b/>
-                <w:sz w:val="18"/>
+                <w:sz w:val="17"/>
               </w:rPr>
-              <w:t>HIPAA (US Health)</w:t>
+              <w:t>1. HIPAA (US Health Insurance Portability &amp; Accountability Act)</w:t>
             </w:r>
           </w:p>
         </w:tc>
         <w:tc>
           <w:tcPr>
-            <w:tcW w:type="dxa" w:w="2592"/>
+            <w:tcW w:type="dxa" w:w="2448"/>
             <w:shd w:fill="F8F9FA"/>
             <w:tcMar>
-              <w:top w:w="80" w:type="dxa"/>
-              <w:bottom w:w="80" w:type="dxa"/>
-              <w:left w:w="80" w:type="dxa"/>
-              <w:right w:w="80" w:type="dxa"/>
+              <w:top w:w="60" w:type="dxa"/>
+              <w:bottom w:w="60" w:type="dxa"/>
+              <w:left w:w="60" w:type="dxa"/>
+              <w:right w:w="60" w:type="dxa"/>
             </w:tcMar>
           </w:tcPr>
           <w:p>
             <w:r>
               <w:rPr>
-                <w:sz w:val="18"/>
+                <w:sz w:val="17"/>
               </w:rPr>
-              <w:t>§164.312(a)(1) Access Control &amp; PHI Protection</w:t>
+              <w:t>Technical Safeguards §164.312(a)(1) Access Control &amp; §164.312(b) Audit Controls</w:t>
             </w:r>
           </w:p>
         </w:tc>
         <w:tc>
           <w:tcPr>
-            <w:tcW w:type="dxa" w:w="2880"/>
+            <w:tcW w:type="dxa" w:w="3168"/>
             <w:shd w:fill="F8F9FA"/>
             <w:tcMar>
-              <w:top w:w="80" w:type="dxa"/>
-              <w:bottom w:w="80" w:type="dxa"/>
-              <w:left w:w="80" w:type="dxa"/>
-              <w:right w:w="80" w:type="dxa"/>
+              <w:top w:w="60" w:type="dxa"/>
+              <w:bottom w:w="60" w:type="dxa"/>
+              <w:left w:w="60" w:type="dxa"/>
+              <w:right w:w="60" w:type="dxa"/>
             </w:tcMar>
           </w:tcPr>
           <w:p>
             <w:r>
               <w:rPr>
-                <w:sz w:val="18"/>
+                <w:sz w:val="17"/>
               </w:rPr>
-              <w:t>Automated PHI/MRN entity redaction before model ingress; medical record masking</w:t>
+              <w:t>Automated PHI (Protected Health Information) and MRN (Medical Record Number) redaction before prompt transmission to Gemini models. Ensures patient context remains unidentifiable in model training and context logs.</w:t>
             </w:r>
           </w:p>
         </w:tc>
         <w:tc>
           <w:tcPr>
-            <w:tcW w:type="dxa" w:w="2160"/>
+            <w:tcW w:type="dxa" w:w="2016"/>
             <w:shd w:fill="F8F9FA"/>
             <w:tcMar>
-              <w:top w:w="80" w:type="dxa"/>
-              <w:bottom w:w="80" w:type="dxa"/>
-              <w:left w:w="80" w:type="dxa"/>
-              <w:right w:w="80" w:type="dxa"/>
+              <w:top w:w="60" w:type="dxa"/>
+              <w:bottom w:w="60" w:type="dxa"/>
+              <w:left w:w="60" w:type="dxa"/>
+              <w:right w:w="60" w:type="dxa"/>
             </w:tcMar>
           </w:tcPr>
           <w:p>
             <w:r>
               <w:rPr>
-                <w:sz w:val="18"/>
+                <w:sz w:val="17"/>
               </w:rPr>
-              <w:t>Cloud DLP API + Policy Interceptor</w:t>
+              <w:t>Google Cloud DLP API (`projects.content.inspect`) + OPA Policy Interceptor on Cloud Run.</w:t>
             </w:r>
           </w:p>
         </w:tc>
@@ -431,79 +1083,79 @@
             <w:tcW w:type="dxa" w:w="2160"/>
             <w:shd w:fill="FFFFFF"/>
             <w:tcMar>
-              <w:top w:w="80" w:type="dxa"/>
-              <w:bottom w:w="80" w:type="dxa"/>
-              <w:left w:w="80" w:type="dxa"/>
-              <w:right w:w="80" w:type="dxa"/>
+              <w:top w:w="60" w:type="dxa"/>
+              <w:bottom w:w="60" w:type="dxa"/>
+              <w:left w:w="60" w:type="dxa"/>
+              <w:right w:w="60" w:type="dxa"/>
             </w:tcMar>
           </w:tcPr>
           <w:p>
             <w:r>
               <w:rPr>
                 <w:b/>
-                <w:sz w:val="18"/>
+                <w:sz w:val="17"/>
               </w:rPr>
-              <w:t>SOC 2 Type II</w:t>
+              <w:t>2. SOC 2 Type II Compliance Framework</w:t>
             </w:r>
           </w:p>
         </w:tc>
         <w:tc>
           <w:tcPr>
-            <w:tcW w:type="dxa" w:w="2592"/>
+            <w:tcW w:type="dxa" w:w="2448"/>
             <w:shd w:fill="FFFFFF"/>
             <w:tcMar>
-              <w:top w:w="80" w:type="dxa"/>
-              <w:bottom w:w="80" w:type="dxa"/>
-              <w:left w:w="80" w:type="dxa"/>
-              <w:right w:w="80" w:type="dxa"/>
+              <w:top w:w="60" w:type="dxa"/>
+              <w:bottom w:w="60" w:type="dxa"/>
+              <w:left w:w="60" w:type="dxa"/>
+              <w:right w:w="60" w:type="dxa"/>
             </w:tcMar>
           </w:tcPr>
           <w:p>
             <w:r>
               <w:rPr>
-                <w:sz w:val="18"/>
+                <w:sz w:val="17"/>
               </w:rPr>
-              <w:t>CC6.1 &amp; CC6.8 Tamper-Proof Audit Logging</w:t>
+              <w:t>Trust Services Criteria CC6.1 (Logical Access Controls) &amp; CC6.8 (Tamper-Proof Audit Integrity)</w:t>
             </w:r>
           </w:p>
         </w:tc>
         <w:tc>
           <w:tcPr>
-            <w:tcW w:type="dxa" w:w="2880"/>
+            <w:tcW w:type="dxa" w:w="3168"/>
             <w:shd w:fill="FFFFFF"/>
             <w:tcMar>
-              <w:top w:w="80" w:type="dxa"/>
-              <w:bottom w:w="80" w:type="dxa"/>
-              <w:left w:w="80" w:type="dxa"/>
-              <w:right w:w="80" w:type="dxa"/>
+              <w:top w:w="60" w:type="dxa"/>
+              <w:bottom w:w="60" w:type="dxa"/>
+              <w:left w:w="60" w:type="dxa"/>
+              <w:right w:w="60" w:type="dxa"/>
             </w:tcMar>
           </w:tcPr>
           <w:p>
             <w:r>
               <w:rPr>
-                <w:sz w:val="18"/>
+                <w:sz w:val="17"/>
               </w:rPr>
-              <w:t>SHA-256 block chain linkage with Cloud KMS asymmetric RSA-PSS signatures</w:t>
+              <w:t>SHA-256 block chain linkage connecting every agent prompt, response, and policy violation log. Each block digest is signed asynchronously using Cloud KMS asymmetric RSA-PSS keys, preventing retrospective log tampering.</w:t>
             </w:r>
           </w:p>
         </w:tc>
         <w:tc>
           <w:tcPr>
-            <w:tcW w:type="dxa" w:w="2160"/>
+            <w:tcW w:type="dxa" w:w="2016"/>
             <w:shd w:fill="FFFFFF"/>
             <w:tcMar>
-              <w:top w:w="80" w:type="dxa"/>
-              <w:bottom w:w="80" w:type="dxa"/>
-              <w:left w:w="80" w:type="dxa"/>
-              <w:right w:w="80" w:type="dxa"/>
+              <w:top w:w="60" w:type="dxa"/>
+              <w:bottom w:w="60" w:type="dxa"/>
+              <w:left w:w="60" w:type="dxa"/>
+              <w:right w:w="60" w:type="dxa"/>
             </w:tcMar>
           </w:tcPr>
           <w:p>
             <w:r>
               <w:rPr>
-                <w:sz w:val="18"/>
+                <w:sz w:val="17"/>
               </w:rPr>
-              <w:t>Cloud KMS + BigQuery Audit Ledger</w:t>
+              <w:t>Google Cloud KMS (`RSA_SIGN_PSS_2048_SHA256`) + BigQuery Append-Only Audit Ledger.</w:t>
             </w:r>
           </w:p>
         </w:tc>
@@ -514,79 +1166,79 @@
             <w:tcW w:type="dxa" w:w="2160"/>
             <w:shd w:fill="F8F9FA"/>
             <w:tcMar>
-              <w:top w:w="80" w:type="dxa"/>
-              <w:bottom w:w="80" w:type="dxa"/>
-              <w:left w:w="80" w:type="dxa"/>
-              <w:right w:w="80" w:type="dxa"/>
+              <w:top w:w="60" w:type="dxa"/>
+              <w:bottom w:w="60" w:type="dxa"/>
+              <w:left w:w="60" w:type="dxa"/>
+              <w:right w:w="60" w:type="dxa"/>
             </w:tcMar>
           </w:tcPr>
           <w:p>
             <w:r>
               <w:rPr>
                 <w:b/>
-                <w:sz w:val="18"/>
+                <w:sz w:val="17"/>
               </w:rPr>
-              <w:t>EU GDPR</w:t>
+              <w:t>3. EU GDPR (General Data Protection Regulation)</w:t>
             </w:r>
           </w:p>
         </w:tc>
         <w:tc>
           <w:tcPr>
-            <w:tcW w:type="dxa" w:w="2592"/>
+            <w:tcW w:type="dxa" w:w="2448"/>
             <w:shd w:fill="F8F9FA"/>
             <w:tcMar>
-              <w:top w:w="80" w:type="dxa"/>
-              <w:bottom w:w="80" w:type="dxa"/>
-              <w:left w:w="80" w:type="dxa"/>
-              <w:right w:w="80" w:type="dxa"/>
+              <w:top w:w="60" w:type="dxa"/>
+              <w:bottom w:w="60" w:type="dxa"/>
+              <w:left w:w="60" w:type="dxa"/>
+              <w:right w:w="60" w:type="dxa"/>
             </w:tcMar>
           </w:tcPr>
           <w:p>
             <w:r>
               <w:rPr>
-                <w:sz w:val="18"/>
+                <w:sz w:val="17"/>
               </w:rPr>
-              <w:t>Art. 17 Right to Erasure &amp; Art. 32 Encryption</w:t>
+              <w:t>Article 17 (Right to Erasure) &amp; Article 32 (Security of Processing)</w:t>
             </w:r>
           </w:p>
         </w:tc>
         <w:tc>
           <w:tcPr>
-            <w:tcW w:type="dxa" w:w="2880"/>
+            <w:tcW w:type="dxa" w:w="3168"/>
             <w:shd w:fill="F8F9FA"/>
             <w:tcMar>
-              <w:top w:w="80" w:type="dxa"/>
-              <w:bottom w:w="80" w:type="dxa"/>
-              <w:left w:w="80" w:type="dxa"/>
-              <w:right w:w="80" w:type="dxa"/>
+              <w:top w:w="60" w:type="dxa"/>
+              <w:bottom w:w="60" w:type="dxa"/>
+              <w:left w:w="60" w:type="dxa"/>
+              <w:right w:w="60" w:type="dxa"/>
             </w:tcMar>
           </w:tcPr>
           <w:p>
             <w:r>
               <w:rPr>
-                <w:sz w:val="18"/>
+                <w:sz w:val="17"/>
               </w:rPr>
-              <w:t>Masking PII at rest/transit; cryptographic key destruction for erasure requests</w:t>
+              <w:t>Automated detection of data erasure requests ('forget me', 'delete my data') which triggers key destruction protocols in Cloud KMS, rendering encrypted data at rest unrecoverable.</w:t>
             </w:r>
           </w:p>
         </w:tc>
         <w:tc>
           <w:tcPr>
-            <w:tcW w:type="dxa" w:w="2160"/>
+            <w:tcW w:type="dxa" w:w="2016"/>
             <w:shd w:fill="F8F9FA"/>
             <w:tcMar>
-              <w:top w:w="80" w:type="dxa"/>
-              <w:bottom w:w="80" w:type="dxa"/>
-              <w:left w:w="80" w:type="dxa"/>
-              <w:right w:w="80" w:type="dxa"/>
+              <w:top w:w="60" w:type="dxa"/>
+              <w:bottom w:w="60" w:type="dxa"/>
+              <w:left w:w="60" w:type="dxa"/>
+              <w:right w:w="60" w:type="dxa"/>
             </w:tcMar>
           </w:tcPr>
           <w:p>
             <w:r>
               <w:rPr>
-                <w:sz w:val="18"/>
+                <w:sz w:val="17"/>
               </w:rPr>
-              <w:t>Cloud KMS + Cloud DLP De-identification</w:t>
+              <w:t>Cloud KMS Key Destruction + Cloud DLP De-identification Templates.</w:t>
             </w:r>
           </w:p>
         </w:tc>
@@ -597,79 +1249,79 @@
             <w:tcW w:type="dxa" w:w="2160"/>
             <w:shd w:fill="FFFFFF"/>
             <w:tcMar>
-              <w:top w:w="80" w:type="dxa"/>
-              <w:bottom w:w="80" w:type="dxa"/>
-              <w:left w:w="80" w:type="dxa"/>
-              <w:right w:w="80" w:type="dxa"/>
+              <w:top w:w="60" w:type="dxa"/>
+              <w:bottom w:w="60" w:type="dxa"/>
+              <w:left w:w="60" w:type="dxa"/>
+              <w:right w:w="60" w:type="dxa"/>
             </w:tcMar>
           </w:tcPr>
           <w:p>
             <w:r>
               <w:rPr>
                 <w:b/>
-                <w:sz w:val="18"/>
+                <w:sz w:val="17"/>
               </w:rPr>
-              <w:t>India DPDP Act 2023</w:t>
+              <w:t>4. India DPDP Act 2023 (Digital Personal Data Protection Act)</w:t>
             </w:r>
           </w:p>
         </w:tc>
         <w:tc>
           <w:tcPr>
-            <w:tcW w:type="dxa" w:w="2592"/>
+            <w:tcW w:type="dxa" w:w="2448"/>
             <w:shd w:fill="FFFFFF"/>
             <w:tcMar>
-              <w:top w:w="80" w:type="dxa"/>
-              <w:bottom w:w="80" w:type="dxa"/>
-              <w:left w:w="80" w:type="dxa"/>
-              <w:right w:w="80" w:type="dxa"/>
+              <w:top w:w="60" w:type="dxa"/>
+              <w:bottom w:w="60" w:type="dxa"/>
+              <w:left w:w="60" w:type="dxa"/>
+              <w:right w:w="60" w:type="dxa"/>
             </w:tcMar>
           </w:tcPr>
           <w:p>
             <w:r>
               <w:rPr>
-                <w:sz w:val="18"/>
+                <w:sz w:val="17"/>
               </w:rPr>
-              <w:t>Sec. 8 Data Fiduciary Notice &amp; Aadhaar Masking</w:t>
+              <w:t>Section 8 (Data Fiduciary Obligations &amp; Personal Data Shielding)</w:t>
             </w:r>
           </w:p>
         </w:tc>
         <w:tc>
           <w:tcPr>
-            <w:tcW w:type="dxa" w:w="2880"/>
+            <w:tcW w:type="dxa" w:w="3168"/>
             <w:shd w:fill="FFFFFF"/>
             <w:tcMar>
-              <w:top w:w="80" w:type="dxa"/>
-              <w:bottom w:w="80" w:type="dxa"/>
-              <w:left w:w="80" w:type="dxa"/>
-              <w:right w:w="80" w:type="dxa"/>
+              <w:top w:w="60" w:type="dxa"/>
+              <w:bottom w:w="60" w:type="dxa"/>
+              <w:left w:w="60" w:type="dxa"/>
+              <w:right w:w="60" w:type="dxa"/>
             </w:tcMar>
           </w:tcPr>
           <w:p>
             <w:r>
               <w:rPr>
-                <w:sz w:val="18"/>
+                <w:sz w:val="17"/>
               </w:rPr>
-              <w:t>Regex &amp; Cloud DLP scanning for 12-digit Indian Aadhaar patterns (\b\d{4}-\d{4}-\d{4}\b)</w:t>
+              <w:t>Regex screening (`\b\d{4}-\d{4}-\d{4}\b`) combined with Cloud DLP custom InfoType detectors to mask 12-digit Indian Aadhaar card numbers before prompt submission.</w:t>
             </w:r>
           </w:p>
         </w:tc>
         <w:tc>
           <w:tcPr>
-            <w:tcW w:type="dxa" w:w="2160"/>
+            <w:tcW w:type="dxa" w:w="2016"/>
             <w:shd w:fill="FFFFFF"/>
             <w:tcMar>
-              <w:top w:w="80" w:type="dxa"/>
-              <w:bottom w:w="80" w:type="dxa"/>
-              <w:left w:w="80" w:type="dxa"/>
-              <w:right w:w="80" w:type="dxa"/>
+              <w:top w:w="60" w:type="dxa"/>
+              <w:bottom w:w="60" w:type="dxa"/>
+              <w:left w:w="60" w:type="dxa"/>
+              <w:right w:w="60" w:type="dxa"/>
             </w:tcMar>
           </w:tcPr>
           <w:p>
             <w:r>
               <w:rPr>
-                <w:sz w:val="18"/>
+                <w:sz w:val="17"/>
               </w:rPr>
-              <w:t>Cloud DLP + Custom Policy Engine</w:t>
+              <w:t>Cloud DLP Custom InfoType `INDIA_AADHAAR` + Policy Ingress Gateway.</w:t>
             </w:r>
           </w:p>
         </w:tc>
@@ -680,79 +1332,79 @@
             <w:tcW w:type="dxa" w:w="2160"/>
             <w:shd w:fill="F8F9FA"/>
             <w:tcMar>
-              <w:top w:w="80" w:type="dxa"/>
-              <w:bottom w:w="80" w:type="dxa"/>
-              <w:left w:w="80" w:type="dxa"/>
-              <w:right w:w="80" w:type="dxa"/>
+              <w:top w:w="60" w:type="dxa"/>
+              <w:bottom w:w="60" w:type="dxa"/>
+              <w:left w:w="60" w:type="dxa"/>
+              <w:right w:w="60" w:type="dxa"/>
             </w:tcMar>
           </w:tcPr>
           <w:p>
             <w:r>
               <w:rPr>
                 <w:b/>
-                <w:sz w:val="18"/>
+                <w:sz w:val="17"/>
               </w:rPr>
-              <w:t>Gemini Trust Platform</w:t>
+              <w:t>5. Google Gemini Trust Platform Standards</w:t>
             </w:r>
           </w:p>
         </w:tc>
         <w:tc>
           <w:tcPr>
-            <w:tcW w:type="dxa" w:w="2592"/>
+            <w:tcW w:type="dxa" w:w="2448"/>
             <w:shd w:fill="F8F9FA"/>
             <w:tcMar>
-              <w:top w:w="80" w:type="dxa"/>
-              <w:bottom w:w="80" w:type="dxa"/>
-              <w:left w:w="80" w:type="dxa"/>
-              <w:right w:w="80" w:type="dxa"/>
+              <w:top w:w="60" w:type="dxa"/>
+              <w:bottom w:w="60" w:type="dxa"/>
+              <w:left w:w="60" w:type="dxa"/>
+              <w:right w:w="60" w:type="dxa"/>
             </w:tcMar>
           </w:tcPr>
           <w:p>
             <w:r>
               <w:rPr>
-                <w:sz w:val="18"/>
+                <w:sz w:val="17"/>
               </w:rPr>
-              <w:t>Groundedness &amp; Safety Standards</w:t>
+              <w:t>Groundedness Verification &amp; Harm Category Safety Thresholds</w:t>
             </w:r>
           </w:p>
         </w:tc>
         <w:tc>
           <w:tcPr>
-            <w:tcW w:type="dxa" w:w="2880"/>
+            <w:tcW w:type="dxa" w:w="3168"/>
             <w:shd w:fill="F8F9FA"/>
             <w:tcMar>
-              <w:top w:w="80" w:type="dxa"/>
-              <w:bottom w:w="80" w:type="dxa"/>
-              <w:left w:w="80" w:type="dxa"/>
-              <w:right w:w="80" w:type="dxa"/>
+              <w:top w:w="60" w:type="dxa"/>
+              <w:bottom w:w="60" w:type="dxa"/>
+              <w:left w:w="60" w:type="dxa"/>
+              <w:right w:w="60" w:type="dxa"/>
             </w:tcMar>
           </w:tcPr>
           <w:p>
             <w:r>
               <w:rPr>
-                <w:sz w:val="18"/>
+                <w:sz w:val="17"/>
               </w:rPr>
-              <w:t>Automated citation grounding score calculation &amp; Harm Category safety thresholds</w:t>
+              <w:t>Enforces `google.genai.types.SafetySetting` across Harassment, Hate Speech, and Dangerous Content (`BLOCK_MEDIUM_AND_ABOVE`). Evaluates citation precision against enterprise data stores, flagging responses under 85% grounding score as `UNGROUNDED_WARNING`.</w:t>
             </w:r>
           </w:p>
         </w:tc>
         <w:tc>
           <w:tcPr>
-            <w:tcW w:type="dxa" w:w="2160"/>
+            <w:tcW w:type="dxa" w:w="2016"/>
             <w:shd w:fill="F8F9FA"/>
             <w:tcMar>
-              <w:top w:w="80" w:type="dxa"/>
-              <w:bottom w:w="80" w:type="dxa"/>
-              <w:left w:w="80" w:type="dxa"/>
-              <w:right w:w="80" w:type="dxa"/>
+              <w:top w:w="60" w:type="dxa"/>
+              <w:bottom w:w="60" w:type="dxa"/>
+              <w:left w:w="60" w:type="dxa"/>
+              <w:right w:w="60" w:type="dxa"/>
             </w:tcMar>
           </w:tcPr>
           <w:p>
             <w:r>
               <w:rPr>
-                <w:sz w:val="18"/>
+                <w:sz w:val="17"/>
               </w:rPr>
-              <w:t>Agent Search &amp; Gemini Safety Guardrails</w:t>
+              <w:t>Agent Search Grounding Engine + Gemini Safety Guardrails.</w:t>
             </w:r>
           </w:p>
         </w:tc>
@@ -773,20 +1425,7 @@
           <w:color w:val="1A73E8"/>
           <w:sz w:val="30"/>
         </w:rPr>
-        <w:t>3. Feature-Wise Agent Policy Roadmap &amp; Application Screenshots</w:t>
-      </w:r>
-    </w:p>
-    <w:p>
-      <w:pPr>
-        <w:spacing w:before="280" w:after="80"/>
-      </w:pPr>
-      <w:r>
-        <w:rPr>
-          <w:b/>
-          <w:color w:val="1A73E8"/>
-          <w:sz w:val="26"/>
-        </w:rPr>
-        <w:t>Feature 1: Ingress &amp; Egress Agent Policy Engine (Zero-Trust Interceptor)</w:t>
+        <w:t>Part III: Cryptographic Audit Architecture &amp; Compliance Reporting</w:t>
       </w:r>
     </w:p>
     <w:p>
@@ -794,1589 +1433,53 @@
         <w:spacing w:after="160"/>
       </w:pPr>
       <w:r>
-        <w:t>Establishes a high-throughput Policy Ingress Gateway on Cloud Run inspecting 100% of prompts, tool outputs, and inter-agent messages before model execution.</w:t>
+        <w:t>To satisfy SOC 2 Type II and HIPAA audit requirements, the system enforces tamper-evident cryptographic block generation for every processed event:</w:t>
       </w:r>
     </w:p>
     <w:p>
       <w:pPr>
-        <w:spacing w:before="80" w:after="80"/>
-        <w:jc w:val="center"/>
+        <w:pStyle w:val="ListBullet"/>
+        <w:spacing w:after="60"/>
       </w:pPr>
       <w:r>
-        <w:drawing>
-          <wp:inline xmlns:a="http://schemas.openxmlformats.org/drawingml/2006/main" xmlns:pic="http://schemas.openxmlformats.org/drawingml/2006/picture">
-            <wp:extent cx="5486400" cy="3429000"/>
-            <wp:docPr id="1" name="Picture 1"/>
-            <wp:cNvGraphicFramePr>
-              <a:graphicFrameLocks noChangeAspect="1"/>
-            </wp:cNvGraphicFramePr>
-            <a:graphic>
-              <a:graphicData uri="http://schemas.openxmlformats.org/drawingml/2006/picture">
-                <pic:pic>
-                  <pic:nvPicPr>
-                    <pic:cNvPr id="0" name="app_rules.png"/>
-                    <pic:cNvPicPr/>
-                  </pic:nvPicPr>
-                  <pic:blipFill>
-                    <a:blip r:embed="rId9"/>
-                    <a:stretch>
-                      <a:fillRect/>
-                    </a:stretch>
-                  </pic:blipFill>
-                  <pic:spPr>
-                    <a:xfrm>
-                      <a:off x="0" y="0"/>
-                      <a:ext cx="5486400" cy="3429000"/>
-                    </a:xfrm>
-                    <a:prstGeom prst="rect"/>
-                  </pic:spPr>
-                </pic:pic>
-              </a:graphicData>
-            </a:graphic>
-          </wp:inline>
-        </w:drawing>
+        <w:rPr>
+          <w:b/>
+        </w:rPr>
+        <w:t xml:space="preserve">SHA-256 Hash Linkage: </w:t>
+      </w:r>
+      <w:r>
+        <w:t>Every audit log block contains the SHA-256 hash digest of the preceding record (current.prevHash === prev.hash). Any retrospective alteration of a log record breaks the cryptographic chain.</w:t>
       </w:r>
     </w:p>
     <w:p>
       <w:pPr>
-        <w:spacing w:after="200"/>
-        <w:jc w:val="center"/>
-      </w:pPr>
-      <w:r>
-        <w:rPr>
-          <w:i/>
-          <w:color w:val="5F6368"/>
-          <w:sz w:val="18"/>
-        </w:rPr>
-        <w:t>Figure 1: Live Application Screenshot from http://localhost:8081/?tab=rules — Agent Policy Engine &amp; Active Guardrails (GDPR-ERASURE, DPDP-AADHAAR, SOC2-INTEGRITY, HIPAA-PII)</w:t>
-      </w:r>
-    </w:p>
-    <w:tbl>
-      <w:tblPr>
-        <w:tblW w:type="auto" w:w="0"/>
-        <w:jc w:val="center"/>
-        <w:tblLayout w:type="fixed"/>
-        <w:tblLook w:firstColumn="1" w:firstRow="1" w:lastColumn="0" w:lastRow="0" w:noHBand="0" w:noVBand="1" w:val="04A0"/>
-      </w:tblPr>
-      <w:tblGrid>
-        <w:gridCol w:w="4968"/>
-        <w:gridCol w:w="4968"/>
-      </w:tblGrid>
-      <w:tr>
-        <w:tc>
-          <w:tcPr>
-            <w:tcW w:type="dxa" w:w="3168"/>
-            <w:shd w:fill="1A73E8"/>
-            <w:tcMar>
-              <w:top w:w="80" w:type="dxa"/>
-              <w:bottom w:w="80" w:type="dxa"/>
-              <w:left w:w="100" w:type="dxa"/>
-              <w:right w:w="100" w:type="dxa"/>
-            </w:tcMar>
-          </w:tcPr>
-          <w:p>
-            <w:r>
-              <w:rPr>
-                <w:b/>
-                <w:color w:val="FFFFFF"/>
-                <w:sz w:val="19"/>
-              </w:rPr>
-              <w:t>Policy Milestone</w:t>
-            </w:r>
-          </w:p>
-        </w:tc>
-        <w:tc>
-          <w:tcPr>
-            <w:tcW w:type="dxa" w:w="6192"/>
-            <w:shd w:fill="1A73E8"/>
-            <w:tcMar>
-              <w:top w:w="80" w:type="dxa"/>
-              <w:bottom w:w="80" w:type="dxa"/>
-              <w:left w:w="100" w:type="dxa"/>
-              <w:right w:w="100" w:type="dxa"/>
-            </w:tcMar>
-          </w:tcPr>
-          <w:p>
-            <w:r>
-              <w:rPr>
-                <w:b/>
-                <w:color w:val="FFFFFF"/>
-                <w:sz w:val="19"/>
-              </w:rPr>
-              <w:t>Deliverables &amp; Regulatory Verification</w:t>
-            </w:r>
-          </w:p>
-        </w:tc>
-      </w:tr>
-      <w:tr>
-        <w:tc>
-          <w:tcPr>
-            <w:tcW w:type="dxa" w:w="3168"/>
-            <w:shd w:fill="F8F9FA"/>
-            <w:tcMar>
-              <w:top w:w="80" w:type="dxa"/>
-              <w:bottom w:w="80" w:type="dxa"/>
-              <w:left w:w="100" w:type="dxa"/>
-              <w:right w:w="100" w:type="dxa"/>
-            </w:tcMar>
-          </w:tcPr>
-          <w:p>
-            <w:r>
-              <w:rPr>
-                <w:b/>
-                <w:sz w:val="18"/>
-              </w:rPr>
-              <w:t>Phase 1.1: Zero-Trust Interception Middleware</w:t>
-            </w:r>
-          </w:p>
-        </w:tc>
-        <w:tc>
-          <w:tcPr>
-            <w:tcW w:type="dxa" w:w="6192"/>
-            <w:shd w:fill="F8F9FA"/>
-            <w:tcMar>
-              <w:top w:w="80" w:type="dxa"/>
-              <w:bottom w:w="80" w:type="dxa"/>
-              <w:left w:w="100" w:type="dxa"/>
-              <w:right w:w="100" w:type="dxa"/>
-            </w:tcMar>
-          </w:tcPr>
-          <w:p>
-            <w:r>
-              <w:rPr>
-                <w:sz w:val="18"/>
-              </w:rPr>
-              <w:t>Deploy containerized FastAPI/Go proxy workers enforcing sub-25ms latency budget SLA.</w:t>
-            </w:r>
-          </w:p>
-        </w:tc>
-      </w:tr>
-      <w:tr>
-        <w:tc>
-          <w:tcPr>
-            <w:tcW w:type="dxa" w:w="3168"/>
-            <w:shd w:fill="FFFFFF"/>
-            <w:tcMar>
-              <w:top w:w="80" w:type="dxa"/>
-              <w:bottom w:w="80" w:type="dxa"/>
-              <w:left w:w="100" w:type="dxa"/>
-              <w:right w:w="100" w:type="dxa"/>
-            </w:tcMar>
-          </w:tcPr>
-          <w:p>
-            <w:r>
-              <w:rPr>
-                <w:b/>
-                <w:sz w:val="18"/>
-              </w:rPr>
-              <w:t>Phase 1.2: System Instruction &amp; Prefix Escape Shield</w:t>
-            </w:r>
-          </w:p>
-        </w:tc>
-        <w:tc>
-          <w:tcPr>
-            <w:tcW w:type="dxa" w:w="6192"/>
-            <w:shd w:fill="FFFFFF"/>
-            <w:tcMar>
-              <w:top w:w="80" w:type="dxa"/>
-              <w:bottom w:w="80" w:type="dxa"/>
-              <w:left w:w="100" w:type="dxa"/>
-              <w:right w:w="100" w:type="dxa"/>
-            </w:tcMar>
-          </w:tcPr>
-          <w:p>
-            <w:r>
-              <w:rPr>
-                <w:sz w:val="18"/>
-              </w:rPr>
-              <w:t>Implement classifier filtering adversarial jailbreak patterns, prompt injection, and prefix escapes.</w:t>
-            </w:r>
-          </w:p>
-        </w:tc>
-      </w:tr>
-      <w:tr>
-        <w:tc>
-          <w:tcPr>
-            <w:tcW w:type="dxa" w:w="3168"/>
-            <w:shd w:fill="F8F9FA"/>
-            <w:tcMar>
-              <w:top w:w="80" w:type="dxa"/>
-              <w:bottom w:w="80" w:type="dxa"/>
-              <w:left w:w="100" w:type="dxa"/>
-              <w:right w:w="100" w:type="dxa"/>
-            </w:tcMar>
-          </w:tcPr>
-          <w:p>
-            <w:r>
-              <w:rPr>
-                <w:b/>
-                <w:sz w:val="18"/>
-              </w:rPr>
-              <w:t>Phase 1.3: Tool Call Parameter Lockout Engine</w:t>
-            </w:r>
-          </w:p>
-        </w:tc>
-        <w:tc>
-          <w:tcPr>
-            <w:tcW w:type="dxa" w:w="6192"/>
-            <w:shd w:fill="F8F9FA"/>
-            <w:tcMar>
-              <w:top w:w="80" w:type="dxa"/>
-              <w:bottom w:w="80" w:type="dxa"/>
-              <w:left w:w="100" w:type="dxa"/>
-              <w:right w:w="100" w:type="dxa"/>
-            </w:tcMar>
-          </w:tcPr>
-          <w:p>
-            <w:r>
-              <w:rPr>
-                <w:sz w:val="18"/>
-              </w:rPr>
-              <w:t>Validate tool outputs against JSON schemas to block unauthorized system commands (rm -rf, DB drops).</w:t>
-            </w:r>
-          </w:p>
-        </w:tc>
-      </w:tr>
-    </w:tbl>
-    <w:p>
-      <w:pPr>
-        <w:spacing w:after="240"/>
-      </w:pPr>
-    </w:p>
-    <w:p>
-      <w:pPr>
-        <w:spacing w:before="280" w:after="80"/>
+        <w:pStyle w:val="ListBullet"/>
+        <w:spacing w:after="60"/>
       </w:pPr>
       <w:r>
         <w:rPr>
           <w:b/>
-          <w:color w:val="1A73E8"/>
-          <w:sz w:val="26"/>
         </w:rPr>
-        <w:t>Feature 2: Multi-Framework PII/PHI Redaction Engine (HIPAA, GDPR, DPDP 2023)</w:t>
+        <w:t xml:space="preserve">Cloud KMS Asymmetric RSA-PSS Signing: </w:t>
+      </w:r>
+      <w:r>
+        <w:t>Each block digest is digitally signed using an asymmetric key pair in Google Cloud KMS (RSA_SIGN_PSS_2048_SHA256). The public key is available to external auditors to verify log authenticity.</w:t>
       </w:r>
     </w:p>
     <w:p>
       <w:pPr>
+        <w:pStyle w:val="ListBullet"/>
         <w:spacing w:after="160"/>
-      </w:pPr>
-      <w:r>
-        <w:t>Executes automated entity masking on incoming prompts and model responses, shielding sensitive identifiers before data reaches model context windows.</w:t>
-      </w:r>
-    </w:p>
-    <w:p>
-      <w:pPr>
-        <w:spacing w:before="80" w:after="80"/>
-        <w:jc w:val="center"/>
-      </w:pPr>
-      <w:r>
-        <w:drawing>
-          <wp:inline xmlns:a="http://schemas.openxmlformats.org/drawingml/2006/main" xmlns:pic="http://schemas.openxmlformats.org/drawingml/2006/picture">
-            <wp:extent cx="5486400" cy="3429000"/>
-            <wp:docPr id="2" name="Picture 2"/>
-            <wp:cNvGraphicFramePr>
-              <a:graphicFrameLocks noChangeAspect="1"/>
-            </wp:cNvGraphicFramePr>
-            <a:graphic>
-              <a:graphicData uri="http://schemas.openxmlformats.org/drawingml/2006/picture">
-                <pic:pic>
-                  <pic:nvPicPr>
-                    <pic:cNvPr id="0" name="app_compliance.png"/>
-                    <pic:cNvPicPr/>
-                  </pic:nvPicPr>
-                  <pic:blipFill>
-                    <a:blip r:embed="rId10"/>
-                    <a:stretch>
-                      <a:fillRect/>
-                    </a:stretch>
-                  </pic:blipFill>
-                  <pic:spPr>
-                    <a:xfrm>
-                      <a:off x="0" y="0"/>
-                      <a:ext cx="5486400" cy="3429000"/>
-                    </a:xfrm>
-                    <a:prstGeom prst="rect"/>
-                  </pic:spPr>
-                </pic:pic>
-              </a:graphicData>
-            </a:graphic>
-          </wp:inline>
-        </w:drawing>
-      </w:r>
-    </w:p>
-    <w:p>
-      <w:pPr>
-        <w:spacing w:after="200"/>
-        <w:jc w:val="center"/>
-      </w:pPr>
-      <w:r>
-        <w:rPr>
-          <w:i/>
-          <w:color w:val="5F6368"/>
-          <w:sz w:val="18"/>
-        </w:rPr>
-        <w:t>Figure 2: Live Application Screenshot from http://localhost:8081/?tab=compliance — Multi-Framework Regulatory Compliance Auditor Console</w:t>
-      </w:r>
-    </w:p>
-    <w:tbl>
-      <w:tblPr>
-        <w:tblW w:type="auto" w:w="0"/>
-        <w:jc w:val="center"/>
-        <w:tblLayout w:type="fixed"/>
-        <w:tblLook w:firstColumn="1" w:firstRow="1" w:lastColumn="0" w:lastRow="0" w:noHBand="0" w:noVBand="1" w:val="04A0"/>
-      </w:tblPr>
-      <w:tblGrid>
-        <w:gridCol w:w="4968"/>
-        <w:gridCol w:w="4968"/>
-      </w:tblGrid>
-      <w:tr>
-        <w:tc>
-          <w:tcPr>
-            <w:tcW w:type="dxa" w:w="3168"/>
-            <w:shd w:fill="1A73E8"/>
-            <w:tcMar>
-              <w:top w:w="80" w:type="dxa"/>
-              <w:bottom w:w="80" w:type="dxa"/>
-              <w:left w:w="100" w:type="dxa"/>
-              <w:right w:w="100" w:type="dxa"/>
-            </w:tcMar>
-          </w:tcPr>
-          <w:p>
-            <w:r>
-              <w:rPr>
-                <w:b/>
-                <w:color w:val="FFFFFF"/>
-                <w:sz w:val="19"/>
-              </w:rPr>
-              <w:t>Policy Milestone</w:t>
-            </w:r>
-          </w:p>
-        </w:tc>
-        <w:tc>
-          <w:tcPr>
-            <w:tcW w:type="dxa" w:w="6192"/>
-            <w:shd w:fill="1A73E8"/>
-            <w:tcMar>
-              <w:top w:w="80" w:type="dxa"/>
-              <w:bottom w:w="80" w:type="dxa"/>
-              <w:left w:w="100" w:type="dxa"/>
-              <w:right w:w="100" w:type="dxa"/>
-            </w:tcMar>
-          </w:tcPr>
-          <w:p>
-            <w:r>
-              <w:rPr>
-                <w:b/>
-                <w:color w:val="FFFFFF"/>
-                <w:sz w:val="19"/>
-              </w:rPr>
-              <w:t>Deliverables &amp; Regulatory Verification</w:t>
-            </w:r>
-          </w:p>
-        </w:tc>
-      </w:tr>
-      <w:tr>
-        <w:tc>
-          <w:tcPr>
-            <w:tcW w:type="dxa" w:w="3168"/>
-            <w:shd w:fill="F8F9FA"/>
-            <w:tcMar>
-              <w:top w:w="80" w:type="dxa"/>
-              <w:bottom w:w="80" w:type="dxa"/>
-              <w:left w:w="100" w:type="dxa"/>
-              <w:right w:w="100" w:type="dxa"/>
-            </w:tcMar>
-          </w:tcPr>
-          <w:p>
-            <w:r>
-              <w:rPr>
-                <w:b/>
-                <w:sz w:val="18"/>
-              </w:rPr>
-              <w:t>Phase 2.1: Regex Pattern Screening</w:t>
-            </w:r>
-          </w:p>
-        </w:tc>
-        <w:tc>
-          <w:tcPr>
-            <w:tcW w:type="dxa" w:w="6192"/>
-            <w:shd w:fill="F8F9FA"/>
-            <w:tcMar>
-              <w:top w:w="80" w:type="dxa"/>
-              <w:bottom w:w="80" w:type="dxa"/>
-              <w:left w:w="100" w:type="dxa"/>
-              <w:right w:w="100" w:type="dxa"/>
-            </w:tcMar>
-          </w:tcPr>
-          <w:p>
-            <w:r>
-              <w:rPr>
-                <w:sz w:val="18"/>
-              </w:rPr>
-              <w:t>Execute local regex scanning for 12-digit Indian Aadhaar patterns (\b\d{4}-\d{4}-\d{4}\b), US SSNs, and Medical Record Numbers (MRNs).</w:t>
-            </w:r>
-          </w:p>
-        </w:tc>
-      </w:tr>
-      <w:tr>
-        <w:tc>
-          <w:tcPr>
-            <w:tcW w:type="dxa" w:w="3168"/>
-            <w:shd w:fill="FFFFFF"/>
-            <w:tcMar>
-              <w:top w:w="80" w:type="dxa"/>
-              <w:bottom w:w="80" w:type="dxa"/>
-              <w:left w:w="100" w:type="dxa"/>
-              <w:right w:w="100" w:type="dxa"/>
-            </w:tcMar>
-          </w:tcPr>
-          <w:p>
-            <w:r>
-              <w:rPr>
-                <w:b/>
-                <w:sz w:val="18"/>
-              </w:rPr>
-              <w:t>Phase 2.2: Google Cloud DLP API Binding</w:t>
-            </w:r>
-          </w:p>
-        </w:tc>
-        <w:tc>
-          <w:tcPr>
-            <w:tcW w:type="dxa" w:w="6192"/>
-            <w:shd w:fill="FFFFFF"/>
-            <w:tcMar>
-              <w:top w:w="80" w:type="dxa"/>
-              <w:bottom w:w="80" w:type="dxa"/>
-              <w:left w:w="100" w:type="dxa"/>
-              <w:right w:w="100" w:type="dxa"/>
-            </w:tcMar>
-          </w:tcPr>
-          <w:p>
-            <w:r>
-              <w:rPr>
-                <w:sz w:val="18"/>
-              </w:rPr>
-              <w:t>Connect Cloud DLP API projects.content.inspect for deep contextual entity detection under HIPAA and DPDP Act 2023.</w:t>
-            </w:r>
-          </w:p>
-        </w:tc>
-      </w:tr>
-      <w:tr>
-        <w:tc>
-          <w:tcPr>
-            <w:tcW w:type="dxa" w:w="3168"/>
-            <w:shd w:fill="F8F9FA"/>
-            <w:tcMar>
-              <w:top w:w="80" w:type="dxa"/>
-              <w:bottom w:w="80" w:type="dxa"/>
-              <w:left w:w="100" w:type="dxa"/>
-              <w:right w:w="100" w:type="dxa"/>
-            </w:tcMar>
-          </w:tcPr>
-          <w:p>
-            <w:r>
-              <w:rPr>
-                <w:b/>
-                <w:sz w:val="18"/>
-              </w:rPr>
-              <w:t>Phase 2.3: GDPR Right to Erasure Key Vault</w:t>
-            </w:r>
-          </w:p>
-        </w:tc>
-        <w:tc>
-          <w:tcPr>
-            <w:tcW w:type="dxa" w:w="6192"/>
-            <w:shd w:fill="F8F9FA"/>
-            <w:tcMar>
-              <w:top w:w="80" w:type="dxa"/>
-              <w:bottom w:w="80" w:type="dxa"/>
-              <w:left w:w="100" w:type="dxa"/>
-              <w:right w:w="100" w:type="dxa"/>
-            </w:tcMar>
-          </w:tcPr>
-          <w:p>
-            <w:r>
-              <w:rPr>
-                <w:sz w:val="18"/>
-              </w:rPr>
-              <w:t>Implement cryptographic key destruction protocols enforcing GDPR Art. 17 data erasure compliance.</w:t>
-            </w:r>
-          </w:p>
-        </w:tc>
-      </w:tr>
-    </w:tbl>
-    <w:p>
-      <w:pPr>
-        <w:spacing w:after="240"/>
-      </w:pPr>
-    </w:p>
-    <w:p>
-      <w:pPr>
-        <w:spacing w:before="280" w:after="80"/>
       </w:pPr>
       <w:r>
         <w:rPr>
           <w:b/>
-          <w:color w:val="1A73E8"/>
-          <w:sz w:val="26"/>
         </w:rPr>
-        <w:t>Feature 3: Gemini Trust Safety Guardrails &amp; Fact-Checking Engine</w:t>
+        <w:t xml:space="preserve">BigQuery Append-Only Audit Ledger: </w:t>
       </w:r>
-    </w:p>
-    <w:p>
-      <w:pPr>
-        <w:spacing w:after="160"/>
-      </w:pPr>
       <w:r>
-        <w:t>Enforces model safety category thresholds and validates model output factuality against enterprise knowledge stores using Agent Search Grounding.</w:t>
+        <w:t>Signed blocks are written to an append-only BigQuery table (ai_governance_audit.ledger_blocks) configured with partition expiration locks, restricting write access to the automated KMS pipeline.</w:t>
       </w:r>
-    </w:p>
-    <w:p>
-      <w:pPr>
-        <w:spacing w:before="80" w:after="80"/>
-        <w:jc w:val="center"/>
-      </w:pPr>
-      <w:r>
-        <w:drawing>
-          <wp:inline xmlns:a="http://schemas.openxmlformats.org/drawingml/2006/main" xmlns:pic="http://schemas.openxmlformats.org/drawingml/2006/picture">
-            <wp:extent cx="5486400" cy="3429000"/>
-            <wp:docPr id="3" name="Picture 3"/>
-            <wp:cNvGraphicFramePr>
-              <a:graphicFrameLocks noChangeAspect="1"/>
-            </wp:cNvGraphicFramePr>
-            <a:graphic>
-              <a:graphicData uri="http://schemas.openxmlformats.org/drawingml/2006/picture">
-                <pic:pic>
-                  <pic:nvPicPr>
-                    <pic:cNvPr id="0" name="app_grounding.png"/>
-                    <pic:cNvPicPr/>
-                  </pic:nvPicPr>
-                  <pic:blipFill>
-                    <a:blip r:embed="rId11"/>
-                    <a:stretch>
-                      <a:fillRect/>
-                    </a:stretch>
-                  </pic:blipFill>
-                  <pic:spPr>
-                    <a:xfrm>
-                      <a:off x="0" y="0"/>
-                      <a:ext cx="5486400" cy="3429000"/>
-                    </a:xfrm>
-                    <a:prstGeom prst="rect"/>
-                  </pic:spPr>
-                </pic:pic>
-              </a:graphicData>
-            </a:graphic>
-          </wp:inline>
-        </w:drawing>
-      </w:r>
-    </w:p>
-    <w:p>
-      <w:pPr>
-        <w:spacing w:after="200"/>
-        <w:jc w:val="center"/>
-      </w:pPr>
-      <w:r>
-        <w:rPr>
-          <w:i/>
-          <w:color w:val="5F6368"/>
-          <w:sz w:val="18"/>
-        </w:rPr>
-        <w:t>Figure 3: Live Application Screenshot from http://localhost:8081/?tab=grounding — Agent Search Citation Grounding Verification &amp; Explainability Console</w:t>
-      </w:r>
-    </w:p>
-    <w:tbl>
-      <w:tblPr>
-        <w:tblW w:type="auto" w:w="0"/>
-        <w:jc w:val="center"/>
-        <w:tblLayout w:type="fixed"/>
-        <w:tblLook w:firstColumn="1" w:firstRow="1" w:lastColumn="0" w:lastRow="0" w:noHBand="0" w:noVBand="1" w:val="04A0"/>
-      </w:tblPr>
-      <w:tblGrid>
-        <w:gridCol w:w="4968"/>
-        <w:gridCol w:w="4968"/>
-      </w:tblGrid>
-      <w:tr>
-        <w:tc>
-          <w:tcPr>
-            <w:tcW w:type="dxa" w:w="3168"/>
-            <w:shd w:fill="1A73E8"/>
-            <w:tcMar>
-              <w:top w:w="80" w:type="dxa"/>
-              <w:bottom w:w="80" w:type="dxa"/>
-              <w:left w:w="100" w:type="dxa"/>
-              <w:right w:w="100" w:type="dxa"/>
-            </w:tcMar>
-          </w:tcPr>
-          <w:p>
-            <w:r>
-              <w:rPr>
-                <w:b/>
-                <w:color w:val="FFFFFF"/>
-                <w:sz w:val="19"/>
-              </w:rPr>
-              <w:t>Policy Milestone</w:t>
-            </w:r>
-          </w:p>
-        </w:tc>
-        <w:tc>
-          <w:tcPr>
-            <w:tcW w:type="dxa" w:w="6192"/>
-            <w:shd w:fill="1A73E8"/>
-            <w:tcMar>
-              <w:top w:w="80" w:type="dxa"/>
-              <w:bottom w:w="80" w:type="dxa"/>
-              <w:left w:w="100" w:type="dxa"/>
-              <w:right w:w="100" w:type="dxa"/>
-            </w:tcMar>
-          </w:tcPr>
-          <w:p>
-            <w:r>
-              <w:rPr>
-                <w:b/>
-                <w:color w:val="FFFFFF"/>
-                <w:sz w:val="19"/>
-              </w:rPr>
-              <w:t>Deliverables &amp; Regulatory Verification</w:t>
-            </w:r>
-          </w:p>
-        </w:tc>
-      </w:tr>
-      <w:tr>
-        <w:tc>
-          <w:tcPr>
-            <w:tcW w:type="dxa" w:w="3168"/>
-            <w:shd w:fill="F8F9FA"/>
-            <w:tcMar>
-              <w:top w:w="80" w:type="dxa"/>
-              <w:bottom w:w="80" w:type="dxa"/>
-              <w:left w:w="100" w:type="dxa"/>
-              <w:right w:w="100" w:type="dxa"/>
-            </w:tcMar>
-          </w:tcPr>
-          <w:p>
-            <w:r>
-              <w:rPr>
-                <w:b/>
-                <w:sz w:val="18"/>
-              </w:rPr>
-              <w:t>Phase 3.1: Harm Category Threshold Mapping</w:t>
-            </w:r>
-          </w:p>
-        </w:tc>
-        <w:tc>
-          <w:tcPr>
-            <w:tcW w:type="dxa" w:w="6192"/>
-            <w:shd w:fill="F8F9FA"/>
-            <w:tcMar>
-              <w:top w:w="80" w:type="dxa"/>
-              <w:bottom w:w="80" w:type="dxa"/>
-              <w:left w:w="100" w:type="dxa"/>
-              <w:right w:w="100" w:type="dxa"/>
-            </w:tcMar>
-          </w:tcPr>
-          <w:p>
-            <w:r>
-              <w:rPr>
-                <w:sz w:val="18"/>
-              </w:rPr>
-              <w:t>Bind UI security controls to google.genai.types.SafetySetting (Harassment, Hate Speech, Dangerous Content set to BLOCK_MEDIUM_AND_ABOVE).</w:t>
-            </w:r>
-          </w:p>
-        </w:tc>
-      </w:tr>
-      <w:tr>
-        <w:tc>
-          <w:tcPr>
-            <w:tcW w:type="dxa" w:w="3168"/>
-            <w:shd w:fill="FFFFFF"/>
-            <w:tcMar>
-              <w:top w:w="80" w:type="dxa"/>
-              <w:bottom w:w="80" w:type="dxa"/>
-              <w:left w:w="100" w:type="dxa"/>
-              <w:right w:w="100" w:type="dxa"/>
-            </w:tcMar>
-          </w:tcPr>
-          <w:p>
-            <w:r>
-              <w:rPr>
-                <w:b/>
-                <w:sz w:val="18"/>
-              </w:rPr>
-              <w:t>Phase 3.2: Agent Search Grounding Citation Precision</w:t>
-            </w:r>
-          </w:p>
-        </w:tc>
-        <w:tc>
-          <w:tcPr>
-            <w:tcW w:type="dxa" w:w="6192"/>
-            <w:shd w:fill="FFFFFF"/>
-            <w:tcMar>
-              <w:top w:w="80" w:type="dxa"/>
-              <w:bottom w:w="80" w:type="dxa"/>
-              <w:left w:w="100" w:type="dxa"/>
-              <w:right w:w="100" w:type="dxa"/>
-            </w:tcMar>
-          </w:tcPr>
-          <w:p>
-            <w:r>
-              <w:rPr>
-                <w:sz w:val="18"/>
-              </w:rPr>
-              <w:t>Index enterprise documentation into Agent Search Data Stores and calculate citation precision scores.</w:t>
-            </w:r>
-          </w:p>
-        </w:tc>
-      </w:tr>
-      <w:tr>
-        <w:tc>
-          <w:tcPr>
-            <w:tcW w:type="dxa" w:w="3168"/>
-            <w:shd w:fill="F8F9FA"/>
-            <w:tcMar>
-              <w:top w:w="80" w:type="dxa"/>
-              <w:bottom w:w="80" w:type="dxa"/>
-              <w:left w:w="100" w:type="dxa"/>
-              <w:right w:w="100" w:type="dxa"/>
-            </w:tcMar>
-          </w:tcPr>
-          <w:p>
-            <w:r>
-              <w:rPr>
-                <w:b/>
-                <w:sz w:val="18"/>
-              </w:rPr>
-              <w:t>Phase 3.3: Ungrounded Output Intervention</w:t>
-            </w:r>
-          </w:p>
-        </w:tc>
-        <w:tc>
-          <w:tcPr>
-            <w:tcW w:type="dxa" w:w="6192"/>
-            <w:shd w:fill="F8F9FA"/>
-            <w:tcMar>
-              <w:top w:w="80" w:type="dxa"/>
-              <w:bottom w:w="80" w:type="dxa"/>
-              <w:left w:w="100" w:type="dxa"/>
-              <w:right w:w="100" w:type="dxa"/>
-            </w:tcMar>
-          </w:tcPr>
-          <w:p>
-            <w:r>
-              <w:rPr>
-                <w:sz w:val="18"/>
-              </w:rPr>
-              <w:t>Automatically flag model outputs under 85% grounding confidence with UNGROUNDED_WARNING for compliance officer review.</w:t>
-            </w:r>
-          </w:p>
-        </w:tc>
-      </w:tr>
-    </w:tbl>
-    <w:p>
-      <w:pPr>
-        <w:spacing w:after="240"/>
-      </w:pPr>
-    </w:p>
-    <w:p>
-      <w:pPr>
-        <w:spacing w:before="280" w:after="80"/>
-      </w:pPr>
-      <w:r>
-        <w:rPr>
-          <w:b/>
-          <w:color w:val="1A73E8"/>
-          <w:sz w:val="26"/>
-        </w:rPr>
-        <w:t>Feature 4: Immutable Cryptographic Compliance Audit Ledger &amp; Exporter</w:t>
-      </w:r>
-    </w:p>
-    <w:p>
-      <w:pPr>
-        <w:spacing w:after="160"/>
-      </w:pPr>
-      <w:r>
-        <w:t>Guarantees tamper-proof logging of all governance decisions by signing SHA-256 block chains using Google Cloud KMS asymmetric RSA-PSS keys.</w:t>
-      </w:r>
-    </w:p>
-    <w:p>
-      <w:pPr>
-        <w:spacing w:before="80" w:after="80"/>
-        <w:jc w:val="center"/>
-      </w:pPr>
-      <w:r>
-        <w:drawing>
-          <wp:inline xmlns:a="http://schemas.openxmlformats.org/drawingml/2006/main" xmlns:pic="http://schemas.openxmlformats.org/drawingml/2006/picture">
-            <wp:extent cx="5486400" cy="3429000"/>
-            <wp:docPr id="4" name="Picture 4"/>
-            <wp:cNvGraphicFramePr>
-              <a:graphicFrameLocks noChangeAspect="1"/>
-            </wp:cNvGraphicFramePr>
-            <a:graphic>
-              <a:graphicData uri="http://schemas.openxmlformats.org/drawingml/2006/picture">
-                <pic:pic>
-                  <pic:nvPicPr>
-                    <pic:cNvPr id="0" name="app_audit.png"/>
-                    <pic:cNvPicPr/>
-                  </pic:nvPicPr>
-                  <pic:blipFill>
-                    <a:blip r:embed="rId12"/>
-                    <a:stretch>
-                      <a:fillRect/>
-                    </a:stretch>
-                  </pic:blipFill>
-                  <pic:spPr>
-                    <a:xfrm>
-                      <a:off x="0" y="0"/>
-                      <a:ext cx="5486400" cy="3429000"/>
-                    </a:xfrm>
-                    <a:prstGeom prst="rect"/>
-                  </pic:spPr>
-                </pic:pic>
-              </a:graphicData>
-            </a:graphic>
-          </wp:inline>
-        </w:drawing>
-      </w:r>
-    </w:p>
-    <w:p>
-      <w:pPr>
-        <w:spacing w:after="200"/>
-        <w:jc w:val="center"/>
-      </w:pPr>
-      <w:r>
-        <w:rPr>
-          <w:i/>
-          <w:color w:val="5F6368"/>
-          <w:sz w:val="18"/>
-        </w:rPr>
-        <w:t>Figure 4: Live Application Screenshot from http://localhost:8081/?tab=audit — Tamper-Evident Cryptographic Audit Ledger &amp; Chain Verifier</w:t>
-      </w:r>
-    </w:p>
-    <w:tbl>
-      <w:tblPr>
-        <w:tblW w:type="auto" w:w="0"/>
-        <w:jc w:val="center"/>
-        <w:tblLayout w:type="fixed"/>
-        <w:tblLook w:firstColumn="1" w:firstRow="1" w:lastColumn="0" w:lastRow="0" w:noHBand="0" w:noVBand="1" w:val="04A0"/>
-      </w:tblPr>
-      <w:tblGrid>
-        <w:gridCol w:w="4968"/>
-        <w:gridCol w:w="4968"/>
-      </w:tblGrid>
-      <w:tr>
-        <w:tc>
-          <w:tcPr>
-            <w:tcW w:type="dxa" w:w="3168"/>
-            <w:shd w:fill="1A73E8"/>
-            <w:tcMar>
-              <w:top w:w="80" w:type="dxa"/>
-              <w:bottom w:w="80" w:type="dxa"/>
-              <w:left w:w="100" w:type="dxa"/>
-              <w:right w:w="100" w:type="dxa"/>
-            </w:tcMar>
-          </w:tcPr>
-          <w:p>
-            <w:r>
-              <w:rPr>
-                <w:b/>
-                <w:color w:val="FFFFFF"/>
-                <w:sz w:val="19"/>
-              </w:rPr>
-              <w:t>Policy Milestone</w:t>
-            </w:r>
-          </w:p>
-        </w:tc>
-        <w:tc>
-          <w:tcPr>
-            <w:tcW w:type="dxa" w:w="6192"/>
-            <w:shd w:fill="1A73E8"/>
-            <w:tcMar>
-              <w:top w:w="80" w:type="dxa"/>
-              <w:bottom w:w="80" w:type="dxa"/>
-              <w:left w:w="100" w:type="dxa"/>
-              <w:right w:w="100" w:type="dxa"/>
-            </w:tcMar>
-          </w:tcPr>
-          <w:p>
-            <w:r>
-              <w:rPr>
-                <w:b/>
-                <w:color w:val="FFFFFF"/>
-                <w:sz w:val="19"/>
-              </w:rPr>
-              <w:t>Deliverables &amp; Regulatory Verification</w:t>
-            </w:r>
-          </w:p>
-        </w:tc>
-      </w:tr>
-      <w:tr>
-        <w:tc>
-          <w:tcPr>
-            <w:tcW w:type="dxa" w:w="3168"/>
-            <w:shd w:fill="F8F9FA"/>
-            <w:tcMar>
-              <w:top w:w="80" w:type="dxa"/>
-              <w:bottom w:w="80" w:type="dxa"/>
-              <w:left w:w="100" w:type="dxa"/>
-              <w:right w:w="100" w:type="dxa"/>
-            </w:tcMar>
-          </w:tcPr>
-          <w:p>
-            <w:r>
-              <w:rPr>
-                <w:b/>
-                <w:sz w:val="18"/>
-              </w:rPr>
-              <w:t>Phase 4.1: SHA-256 Block Hashing Chain</w:t>
-            </w:r>
-          </w:p>
-        </w:tc>
-        <w:tc>
-          <w:tcPr>
-            <w:tcW w:type="dxa" w:w="6192"/>
-            <w:shd w:fill="F8F9FA"/>
-            <w:tcMar>
-              <w:top w:w="80" w:type="dxa"/>
-              <w:bottom w:w="80" w:type="dxa"/>
-              <w:left w:w="100" w:type="dxa"/>
-              <w:right w:w="100" w:type="dxa"/>
-            </w:tcMar>
-          </w:tcPr>
-          <w:p>
-            <w:r>
-              <w:rPr>
-                <w:sz w:val="18"/>
-              </w:rPr>
-              <w:t>Enforce current.prev_hash === prev.hash block chain linkage for all policy trigger events.</w:t>
-            </w:r>
-          </w:p>
-        </w:tc>
-      </w:tr>
-      <w:tr>
-        <w:tc>
-          <w:tcPr>
-            <w:tcW w:type="dxa" w:w="3168"/>
-            <w:shd w:fill="FFFFFF"/>
-            <w:tcMar>
-              <w:top w:w="80" w:type="dxa"/>
-              <w:bottom w:w="80" w:type="dxa"/>
-              <w:left w:w="100" w:type="dxa"/>
-              <w:right w:w="100" w:type="dxa"/>
-            </w:tcMar>
-          </w:tcPr>
-          <w:p>
-            <w:r>
-              <w:rPr>
-                <w:b/>
-                <w:sz w:val="18"/>
-              </w:rPr>
-              <w:t>Phase 4.2: Cloud KMS Digital Signature Engine</w:t>
-            </w:r>
-          </w:p>
-        </w:tc>
-        <w:tc>
-          <w:tcPr>
-            <w:tcW w:type="dxa" w:w="6192"/>
-            <w:shd w:fill="FFFFFF"/>
-            <w:tcMar>
-              <w:top w:w="80" w:type="dxa"/>
-              <w:bottom w:w="80" w:type="dxa"/>
-              <w:left w:w="100" w:type="dxa"/>
-              <w:right w:w="100" w:type="dxa"/>
-            </w:tcMar>
-          </w:tcPr>
-          <w:p>
-            <w:r>
-              <w:rPr>
-                <w:sz w:val="18"/>
-              </w:rPr>
-              <w:t>Sign block hashes using Google Cloud KMS RSA_SIGN_PSS_2048_SHA256 asymmetric keys.</w:t>
-            </w:r>
-          </w:p>
-        </w:tc>
-      </w:tr>
-      <w:tr>
-        <w:tc>
-          <w:tcPr>
-            <w:tcW w:type="dxa" w:w="3168"/>
-            <w:shd w:fill="F8F9FA"/>
-            <w:tcMar>
-              <w:top w:w="80" w:type="dxa"/>
-              <w:bottom w:w="80" w:type="dxa"/>
-              <w:left w:w="100" w:type="dxa"/>
-              <w:right w:w="100" w:type="dxa"/>
-            </w:tcMar>
-          </w:tcPr>
-          <w:p>
-            <w:r>
-              <w:rPr>
-                <w:b/>
-                <w:sz w:val="18"/>
-              </w:rPr>
-              <w:t>Phase 4.3: Audit Package Exporter</w:t>
-            </w:r>
-          </w:p>
-        </w:tc>
-        <w:tc>
-          <w:tcPr>
-            <w:tcW w:type="dxa" w:w="6192"/>
-            <w:shd w:fill="F8F9FA"/>
-            <w:tcMar>
-              <w:top w:w="80" w:type="dxa"/>
-              <w:bottom w:w="80" w:type="dxa"/>
-              <w:left w:w="100" w:type="dxa"/>
-              <w:right w:w="100" w:type="dxa"/>
-            </w:tcMar>
-          </w:tcPr>
-          <w:p>
-            <w:r>
-              <w:rPr>
-                <w:sz w:val="18"/>
-              </w:rPr>
-              <w:t>Generate signed PDF and CSV compliance audit packages for SOC 2 Type II and HIPAA regulatory audits.</w:t>
-            </w:r>
-          </w:p>
-        </w:tc>
-      </w:tr>
-    </w:tbl>
-    <w:p>
-      <w:pPr>
-        <w:spacing w:after="240"/>
-      </w:pPr>
-    </w:p>
-    <w:p>
-      <w:pPr>
-        <w:spacing w:before="280" w:after="80"/>
-      </w:pPr>
-      <w:r>
-        <w:rPr>
-          <w:b/>
-          <w:color w:val="1A73E8"/>
-          <w:sz w:val="26"/>
-        </w:rPr>
-        <w:t>Feature 5: Compliance Officer Control Console &amp; Real-Time Telemetry Stream</w:t>
-      </w:r>
-    </w:p>
-    <w:p>
-      <w:pPr>
-        <w:spacing w:after="160"/>
-      </w:pPr>
-      <w:r>
-        <w:t>Provides a real-time command center rendering incoming prompt volumes, blocked attempts, PII redaction counters, and average latency metrics.</w:t>
-      </w:r>
-    </w:p>
-    <w:p>
-      <w:pPr>
-        <w:spacing w:before="80" w:after="80"/>
-        <w:jc w:val="center"/>
-      </w:pPr>
-      <w:r>
-        <w:drawing>
-          <wp:inline xmlns:a="http://schemas.openxmlformats.org/drawingml/2006/main" xmlns:pic="http://schemas.openxmlformats.org/drawingml/2006/picture">
-            <wp:extent cx="5486400" cy="3429000"/>
-            <wp:docPr id="5" name="Picture 5"/>
-            <wp:cNvGraphicFramePr>
-              <a:graphicFrameLocks noChangeAspect="1"/>
-            </wp:cNvGraphicFramePr>
-            <a:graphic>
-              <a:graphicData uri="http://schemas.openxmlformats.org/drawingml/2006/picture">
-                <pic:pic>
-                  <pic:nvPicPr>
-                    <pic:cNvPr id="0" name="app_dashboard.png"/>
-                    <pic:cNvPicPr/>
-                  </pic:nvPicPr>
-                  <pic:blipFill>
-                    <a:blip r:embed="rId13"/>
-                    <a:stretch>
-                      <a:fillRect/>
-                    </a:stretch>
-                  </pic:blipFill>
-                  <pic:spPr>
-                    <a:xfrm>
-                      <a:off x="0" y="0"/>
-                      <a:ext cx="5486400" cy="3429000"/>
-                    </a:xfrm>
-                    <a:prstGeom prst="rect"/>
-                  </pic:spPr>
-                </pic:pic>
-              </a:graphicData>
-            </a:graphic>
-          </wp:inline>
-        </w:drawing>
-      </w:r>
-    </w:p>
-    <w:p>
-      <w:pPr>
-        <w:spacing w:after="200"/>
-        <w:jc w:val="center"/>
-      </w:pPr>
-      <w:r>
-        <w:rPr>
-          <w:i/>
-          <w:color w:val="5F6368"/>
-          <w:sz w:val="18"/>
-        </w:rPr>
-        <w:t>Figure 5: Live Application Screenshot from http://localhost:8081/?tab=dashboard — Control Tower Live Metrics &amp; Risk Telemetry Stream</w:t>
-      </w:r>
-    </w:p>
-    <w:tbl>
-      <w:tblPr>
-        <w:tblW w:type="auto" w:w="0"/>
-        <w:jc w:val="center"/>
-        <w:tblLayout w:type="fixed"/>
-        <w:tblLook w:firstColumn="1" w:firstRow="1" w:lastColumn="0" w:lastRow="0" w:noHBand="0" w:noVBand="1" w:val="04A0"/>
-      </w:tblPr>
-      <w:tblGrid>
-        <w:gridCol w:w="4968"/>
-        <w:gridCol w:w="4968"/>
-      </w:tblGrid>
-      <w:tr>
-        <w:tc>
-          <w:tcPr>
-            <w:tcW w:type="dxa" w:w="3168"/>
-            <w:shd w:fill="1A73E8"/>
-            <w:tcMar>
-              <w:top w:w="80" w:type="dxa"/>
-              <w:bottom w:w="80" w:type="dxa"/>
-              <w:left w:w="100" w:type="dxa"/>
-              <w:right w:w="100" w:type="dxa"/>
-            </w:tcMar>
-          </w:tcPr>
-          <w:p>
-            <w:r>
-              <w:rPr>
-                <w:b/>
-                <w:color w:val="FFFFFF"/>
-                <w:sz w:val="19"/>
-              </w:rPr>
-              <w:t>Policy Milestone</w:t>
-            </w:r>
-          </w:p>
-        </w:tc>
-        <w:tc>
-          <w:tcPr>
-            <w:tcW w:type="dxa" w:w="6192"/>
-            <w:shd w:fill="1A73E8"/>
-            <w:tcMar>
-              <w:top w:w="80" w:type="dxa"/>
-              <w:bottom w:w="80" w:type="dxa"/>
-              <w:left w:w="100" w:type="dxa"/>
-              <w:right w:w="100" w:type="dxa"/>
-            </w:tcMar>
-          </w:tcPr>
-          <w:p>
-            <w:r>
-              <w:rPr>
-                <w:b/>
-                <w:color w:val="FFFFFF"/>
-                <w:sz w:val="19"/>
-              </w:rPr>
-              <w:t>Deliverables &amp; Regulatory Verification</w:t>
-            </w:r>
-          </w:p>
-        </w:tc>
-      </w:tr>
-      <w:tr>
-        <w:tc>
-          <w:tcPr>
-            <w:tcW w:type="dxa" w:w="3168"/>
-            <w:shd w:fill="F8F9FA"/>
-            <w:tcMar>
-              <w:top w:w="80" w:type="dxa"/>
-              <w:bottom w:w="80" w:type="dxa"/>
-              <w:left w:w="100" w:type="dxa"/>
-              <w:right w:w="100" w:type="dxa"/>
-            </w:tcMar>
-          </w:tcPr>
-          <w:p>
-            <w:r>
-              <w:rPr>
-                <w:b/>
-                <w:sz w:val="18"/>
-              </w:rPr>
-              <w:t>Phase 5.1: Cloud Pub/Sub Streaming Bridge</w:t>
-            </w:r>
-          </w:p>
-        </w:tc>
-        <w:tc>
-          <w:tcPr>
-            <w:tcW w:type="dxa" w:w="6192"/>
-            <w:shd w:fill="F8F9FA"/>
-            <w:tcMar>
-              <w:top w:w="80" w:type="dxa"/>
-              <w:bottom w:w="80" w:type="dxa"/>
-              <w:left w:w="100" w:type="dxa"/>
-              <w:right w:w="100" w:type="dxa"/>
-            </w:tcMar>
-          </w:tcPr>
-          <w:p>
-            <w:r>
-              <w:rPr>
-                <w:sz w:val="18"/>
-              </w:rPr>
-              <w:t>Publish governance events to Cloud Pub/Sub, serving real-time Server-Sent Events (SSE) to the dashboard.</w:t>
-            </w:r>
-          </w:p>
-        </w:tc>
-      </w:tr>
-      <w:tr>
-        <w:tc>
-          <w:tcPr>
-            <w:tcW w:type="dxa" w:w="3168"/>
-            <w:shd w:fill="FFFFFF"/>
-            <w:tcMar>
-              <w:top w:w="80" w:type="dxa"/>
-              <w:bottom w:w="80" w:type="dxa"/>
-              <w:left w:w="100" w:type="dxa"/>
-              <w:right w:w="100" w:type="dxa"/>
-            </w:tcMar>
-          </w:tcPr>
-          <w:p>
-            <w:r>
-              <w:rPr>
-                <w:b/>
-                <w:sz w:val="18"/>
-              </w:rPr>
-              <w:t>Phase 5.2: OpenTelemetry Distributed Tracing</w:t>
-            </w:r>
-          </w:p>
-        </w:tc>
-        <w:tc>
-          <w:tcPr>
-            <w:tcW w:type="dxa" w:w="6192"/>
-            <w:shd w:fill="FFFFFF"/>
-            <w:tcMar>
-              <w:top w:w="80" w:type="dxa"/>
-              <w:bottom w:w="80" w:type="dxa"/>
-              <w:left w:w="100" w:type="dxa"/>
-              <w:right w:w="100" w:type="dxa"/>
-            </w:tcMar>
-          </w:tcPr>
-          <w:p>
-            <w:r>
-              <w:rPr>
-                <w:sz w:val="18"/>
-              </w:rPr>
-              <w:t>Pass traceparent headers down inter-agent hops, exporting metrics to Cloud Trace &amp; Cloud Monitoring.</w:t>
-            </w:r>
-          </w:p>
-        </w:tc>
-      </w:tr>
-      <w:tr>
-        <w:tc>
-          <w:tcPr>
-            <w:tcW w:type="dxa" w:w="3168"/>
-            <w:shd w:fill="F8F9FA"/>
-            <w:tcMar>
-              <w:top w:w="80" w:type="dxa"/>
-              <w:bottom w:w="80" w:type="dxa"/>
-              <w:left w:w="100" w:type="dxa"/>
-              <w:right w:w="100" w:type="dxa"/>
-            </w:tcMar>
-          </w:tcPr>
-          <w:p>
-            <w:r>
-              <w:rPr>
-                <w:b/>
-                <w:sz w:val="18"/>
-              </w:rPr>
-              <w:t>Phase 5.3: What-If Shock Simulator Integration</w:t>
-            </w:r>
-          </w:p>
-        </w:tc>
-        <w:tc>
-          <w:tcPr>
-            <w:tcW w:type="dxa" w:w="6192"/>
-            <w:shd w:fill="F8F9FA"/>
-            <w:tcMar>
-              <w:top w:w="80" w:type="dxa"/>
-              <w:bottom w:w="80" w:type="dxa"/>
-              <w:left w:w="100" w:type="dxa"/>
-              <w:right w:w="100" w:type="dxa"/>
-            </w:tcMar>
-          </w:tcPr>
-          <w:p>
-            <w:r>
-              <w:rPr>
-                <w:sz w:val="18"/>
-              </w:rPr>
-              <w:t>Stress-test policy thresholds under simulated traffic spikes (+10% to +50%).</w:t>
-            </w:r>
-          </w:p>
-        </w:tc>
-      </w:tr>
-    </w:tbl>
-    <w:p>
-      <w:pPr>
-        <w:spacing w:after="240"/>
-      </w:pPr>
-    </w:p>
-    <w:p>
-      <w:pPr>
-        <w:spacing w:before="280" w:after="80"/>
-      </w:pPr>
-      <w:r>
-        <w:rPr>
-          <w:b/>
-          <w:color w:val="1A73E8"/>
-          <w:sz w:val="26"/>
-        </w:rPr>
-        <w:t>Feature 6: Multi-Agent Network Policy Intercept &amp; Staging Deployment</w:t>
-      </w:r>
-    </w:p>
-    <w:p>
-      <w:pPr>
-        <w:spacing w:after="160"/>
-      </w:pPr>
-      <w:r>
-        <w:t>Manages inter-agent message policy interception across Orchestrator, TimesFM 2.0, BQML, and Chatbot agents operating under GCP Service Account identities.</w:t>
-      </w:r>
-    </w:p>
-    <w:p>
-      <w:pPr>
-        <w:spacing w:before="80" w:after="80"/>
-        <w:jc w:val="center"/>
-      </w:pPr>
-      <w:r>
-        <w:drawing>
-          <wp:inline xmlns:a="http://schemas.openxmlformats.org/drawingml/2006/main" xmlns:pic="http://schemas.openxmlformats.org/drawingml/2006/picture">
-            <wp:extent cx="5486400" cy="3429000"/>
-            <wp:docPr id="6" name="Picture 6"/>
-            <wp:cNvGraphicFramePr>
-              <a:graphicFrameLocks noChangeAspect="1"/>
-            </wp:cNvGraphicFramePr>
-            <a:graphic>
-              <a:graphicData uri="http://schemas.openxmlformats.org/drawingml/2006/picture">
-                <pic:pic>
-                  <pic:nvPicPr>
-                    <pic:cNvPr id="0" name="app_agentic.png"/>
-                    <pic:cNvPicPr/>
-                  </pic:nvPicPr>
-                  <pic:blipFill>
-                    <a:blip r:embed="rId14"/>
-                    <a:stretch>
-                      <a:fillRect/>
-                    </a:stretch>
-                  </pic:blipFill>
-                  <pic:spPr>
-                    <a:xfrm>
-                      <a:off x="0" y="0"/>
-                      <a:ext cx="5486400" cy="3429000"/>
-                    </a:xfrm>
-                    <a:prstGeom prst="rect"/>
-                  </pic:spPr>
-                </pic:pic>
-              </a:graphicData>
-            </a:graphic>
-          </wp:inline>
-        </w:drawing>
-      </w:r>
-    </w:p>
-    <w:p>
-      <w:pPr>
-        <w:spacing w:after="200"/>
-        <w:jc w:val="center"/>
-      </w:pPr>
-      <w:r>
-        <w:rPr>
-          <w:i/>
-          <w:color w:val="5F6368"/>
-          <w:sz w:val="18"/>
-        </w:rPr>
-        <w:t>Figure 6: Live Application Screenshot from http://localhost:8081/?tab=agentic — Agentic Hub Multi-Agent Registry &amp; Interagent Policy Console</w:t>
-      </w:r>
-    </w:p>
-    <w:tbl>
-      <w:tblPr>
-        <w:tblW w:type="auto" w:w="0"/>
-        <w:jc w:val="center"/>
-        <w:tblLayout w:type="fixed"/>
-        <w:tblLook w:firstColumn="1" w:firstRow="1" w:lastColumn="0" w:lastRow="0" w:noHBand="0" w:noVBand="1" w:val="04A0"/>
-      </w:tblPr>
-      <w:tblGrid>
-        <w:gridCol w:w="4968"/>
-        <w:gridCol w:w="4968"/>
-      </w:tblGrid>
-      <w:tr>
-        <w:tc>
-          <w:tcPr>
-            <w:tcW w:type="dxa" w:w="3168"/>
-            <w:shd w:fill="1A73E8"/>
-            <w:tcMar>
-              <w:top w:w="80" w:type="dxa"/>
-              <w:bottom w:w="80" w:type="dxa"/>
-              <w:left w:w="100" w:type="dxa"/>
-              <w:right w:w="100" w:type="dxa"/>
-            </w:tcMar>
-          </w:tcPr>
-          <w:p>
-            <w:r>
-              <w:rPr>
-                <w:b/>
-                <w:color w:val="FFFFFF"/>
-                <w:sz w:val="19"/>
-              </w:rPr>
-              <w:t>Policy Milestone</w:t>
-            </w:r>
-          </w:p>
-        </w:tc>
-        <w:tc>
-          <w:tcPr>
-            <w:tcW w:type="dxa" w:w="6192"/>
-            <w:shd w:fill="1A73E8"/>
-            <w:tcMar>
-              <w:top w:w="80" w:type="dxa"/>
-              <w:bottom w:w="80" w:type="dxa"/>
-              <w:left w:w="100" w:type="dxa"/>
-              <w:right w:w="100" w:type="dxa"/>
-            </w:tcMar>
-          </w:tcPr>
-          <w:p>
-            <w:r>
-              <w:rPr>
-                <w:b/>
-                <w:color w:val="FFFFFF"/>
-                <w:sz w:val="19"/>
-              </w:rPr>
-              <w:t>Deliverables &amp; Regulatory Verification</w:t>
-            </w:r>
-          </w:p>
-        </w:tc>
-      </w:tr>
-      <w:tr>
-        <w:tc>
-          <w:tcPr>
-            <w:tcW w:type="dxa" w:w="3168"/>
-            <w:shd w:fill="F8F9FA"/>
-            <w:tcMar>
-              <w:top w:w="80" w:type="dxa"/>
-              <w:bottom w:w="80" w:type="dxa"/>
-              <w:left w:w="100" w:type="dxa"/>
-              <w:right w:w="100" w:type="dxa"/>
-            </w:tcMar>
-          </w:tcPr>
-          <w:p>
-            <w:r>
-              <w:rPr>
-                <w:b/>
-                <w:sz w:val="18"/>
-              </w:rPr>
-              <w:t>Phase 6.1: Service Account Workload Identity Binding</w:t>
-            </w:r>
-          </w:p>
-        </w:tc>
-        <w:tc>
-          <w:tcPr>
-            <w:tcW w:type="dxa" w:w="6192"/>
-            <w:shd w:fill="F8F9FA"/>
-            <w:tcMar>
-              <w:top w:w="80" w:type="dxa"/>
-              <w:bottom w:w="80" w:type="dxa"/>
-              <w:left w:w="100" w:type="dxa"/>
-              <w:right w:w="100" w:type="dxa"/>
-            </w:tcMar>
-          </w:tcPr>
-          <w:p>
-            <w:r>
-              <w:rPr>
-                <w:sz w:val="18"/>
-              </w:rPr>
-              <w:t>Bind agents to dedicated Service Accounts (sa:fusion-ai-*) with granular GCP IAM roles.</w:t>
-            </w:r>
-          </w:p>
-        </w:tc>
-      </w:tr>
-      <w:tr>
-        <w:tc>
-          <w:tcPr>
-            <w:tcW w:type="dxa" w:w="3168"/>
-            <w:shd w:fill="FFFFFF"/>
-            <w:tcMar>
-              <w:top w:w="80" w:type="dxa"/>
-              <w:bottom w:w="80" w:type="dxa"/>
-              <w:left w:w="100" w:type="dxa"/>
-              <w:right w:w="100" w:type="dxa"/>
-            </w:tcMar>
-          </w:tcPr>
-          <w:p>
-            <w:r>
-              <w:rPr>
-                <w:b/>
-                <w:sz w:val="18"/>
-              </w:rPr>
-              <w:t>Phase 6.2: Inter-Agent Communication Intercept</w:t>
-            </w:r>
-          </w:p>
-        </w:tc>
-        <w:tc>
-          <w:tcPr>
-            <w:tcW w:type="dxa" w:w="6192"/>
-            <w:shd w:fill="FFFFFF"/>
-            <w:tcMar>
-              <w:top w:w="80" w:type="dxa"/>
-              <w:bottom w:w="80" w:type="dxa"/>
-              <w:left w:w="100" w:type="dxa"/>
-              <w:right w:w="100" w:type="dxa"/>
-            </w:tcMar>
-          </w:tcPr>
-          <w:p>
-            <w:r>
-              <w:rPr>
-                <w:sz w:val="18"/>
-              </w:rPr>
-              <w:t>Inspect inter-agent message payloads for policy violations and credential leaks before delegating actions.</w:t>
-            </w:r>
-          </w:p>
-        </w:tc>
-      </w:tr>
-      <w:tr>
-        <w:tc>
-          <w:tcPr>
-            <w:tcW w:type="dxa" w:w="3168"/>
-            <w:shd w:fill="F8F9FA"/>
-            <w:tcMar>
-              <w:top w:w="80" w:type="dxa"/>
-              <w:bottom w:w="80" w:type="dxa"/>
-              <w:left w:w="100" w:type="dxa"/>
-              <w:right w:w="100" w:type="dxa"/>
-            </w:tcMar>
-          </w:tcPr>
-          <w:p>
-            <w:r>
-              <w:rPr>
-                <w:b/>
-                <w:sz w:val="18"/>
-              </w:rPr>
-              <w:t>Phase 6.3: Production Canary Rollout</w:t>
-            </w:r>
-          </w:p>
-        </w:tc>
-        <w:tc>
-          <w:tcPr>
-            <w:tcW w:type="dxa" w:w="6192"/>
-            <w:shd w:fill="F8F9FA"/>
-            <w:tcMar>
-              <w:top w:w="80" w:type="dxa"/>
-              <w:bottom w:w="80" w:type="dxa"/>
-              <w:left w:w="100" w:type="dxa"/>
-              <w:right w:w="100" w:type="dxa"/>
-            </w:tcMar>
-          </w:tcPr>
-          <w:p>
-            <w:r>
-              <w:rPr>
-                <w:sz w:val="18"/>
-              </w:rPr>
-              <w:t>Deploy Policy Gateway to Cloud Run / GKE with traffic splitting (10% -&gt; 50% -&gt; 100%).</w:t>
-            </w:r>
-          </w:p>
-        </w:tc>
-      </w:tr>
-    </w:tbl>
-    <w:p>
-      <w:pPr>
-        <w:spacing w:after="240"/>
-      </w:pPr>
     </w:p>
     <w:sectPr>
       <w:pgSz w:w="12240" w:h="15840"/>
@@ -2754,7 +1857,7 @@
     <w:rPr>
       <w:rFonts w:ascii="Arial" w:hAnsi="Arial"/>
       <w:color w:val="202124"/>
-      <w:sz w:val="21"/>
+      <w:sz w:val="20"/>
     </w:rPr>
   </w:style>
   <w:style w:type="paragraph" w:styleId="Header">

</xml_diff>